<commit_message>
actualizado documento quitando restos de markdown
</commit_message>
<xml_diff>
--- a/TFM_FranciscoSaez_Memoria.docx
+++ b/TFM_FranciscoSaez_Memoria.docx
@@ -166,7 +166,13 @@
         <w:pStyle w:val="ListBullet"/>
       </w:pPr>
       <w:r>
-        <w:t>**(I) Banco de pruebas reproducible**. Construido con cuatro experimentos (E1–E4), cuatro bases de datos del dominio cisreg (FANTOM5, dbSUPER, HACER, DiseaseEnhancer) y tres semillas (42, 43, 44) para estimar variabilidad inter-corrida. 96 corridas en el experimento principal y 144 corridas adicionales en los sub-experimentos.</w:t>
+        <w:rPr>
+          <w:b/>
+        </w:rPr>
+        <w:t>(I) Banco de pruebas reproducible</w:t>
+      </w:r>
+      <w:r>
+        <w:t>. Construido con cuatro experimentos (E1–E4), cuatro bases de datos del dominio cisreg (FANTOM5, dbSUPER, HACER, DiseaseEnhancer) y tres semillas (42, 43, 44) para estimar variabilidad inter-corrida. 96 corridas en el experimento principal y 144 corridas adicionales en los sub-experimentos.</w:t>
       </w:r>
     </w:p>
     <w:p>
@@ -174,7 +180,13 @@
         <w:pStyle w:val="ListBullet"/>
       </w:pPr>
       <w:r>
-        <w:t>**(I) Replicación funcional de OntoGenix**. Pipeline ejecutada sobre las cuatro BBDD sin la GUI PyQt5, con tres adaptaciones técnicas documentadas (bypass de Searcher, bypass del paso SERP, snapshot del modelo). Detalle en §3.</w:t>
+        <w:rPr>
+          <w:b/>
+        </w:rPr>
+        <w:t>(I) Replicación funcional de OntoGenix</w:t>
+      </w:r>
+      <w:r>
+        <w:t>. Pipeline ejecutada sobre las cuatro BBDD sin la GUI PyQt5, con tres adaptaciones técnicas documentadas (bypass de Searcher, bypass del paso SERP, snapshot del modelo). Detalle en §3.</w:t>
       </w:r>
     </w:p>
     <w:p>
@@ -182,7 +194,13 @@
         <w:pStyle w:val="ListBullet"/>
       </w:pPr>
       <w:r>
-        <w:t>**(I) Métricas objetivas, no caseras**. OQuaRE como marco normativo (§9), implementado contra el razonador HermiT vía owlready2. Cinco sub-características más Global, todas en escala 1–5 con rúbricas publicadas (Duque-Ramos et al., 2014).</w:t>
+        <w:rPr>
+          <w:b/>
+        </w:rPr>
+        <w:t>(I) Métricas objetivas, no caseras</w:t>
+      </w:r>
+      <w:r>
+        <w:t>. OQuaRE como marco normativo (§9), implementado contra el razonador HermiT vía owlready2. Cinco sub-características más Global, todas en escala 1–5 con rúbricas publicadas (Duque-Ramos et al., 2014).</w:t>
       </w:r>
     </w:p>
     <w:p>
@@ -190,7 +208,13 @@
         <w:pStyle w:val="ListBullet"/>
       </w:pPr>
       <w:r>
-        <w:t>**(I) Patrones de error por estrategia y por modelo** documentados en §10.2: Llama omite el «:» del prefijo en cuerpos del esquema; Qwen mezcla sintaxis Turtle con RDF/XML y JSON-LD; gpt-4o no comete ninguno de los dos. Las plantillas cisreg originales también tenían erratas tipográficas (un «&gt;» espurio en crm2tfac.ttl) que el experimento sacó a la luz.</w:t>
+        <w:rPr>
+          <w:b/>
+        </w:rPr>
+        <w:t>(I) Patrones de error por estrategia y por modelo</w:t>
+      </w:r>
+      <w:r>
+        <w:t xml:space="preserve"> documentados en §10.2: Llama omite el «:» del prefijo en cuerpos del esquema; Qwen mezcla sintaxis Turtle con RDF/XML y JSON-LD; gpt-4o no comete ninguno de los dos. Las plantillas cisreg originales también tenían erratas tipográficas (un «&gt;» espurio en crm2tfac.ttl) que el experimento sacó a la luz.</w:t>
       </w:r>
     </w:p>
     <w:p>
@@ -198,7 +222,13 @@
         <w:pStyle w:val="ListBullet"/>
       </w:pPr>
       <w:r>
-        <w:t>**(E) Comparativa cross-model** (§10) entre modelo cerrado (gpt-4o) y dos open-source (Llama 3.1 8B, Qwen 2.5 Coder 7B). Resultado contraintuitivo: en E2 el modelo pequeño supera al grande en OQuaRE, porque la rúbrica penaliza la complejidad. La comparación cualitativa de §8 sigue dando ventaja a gpt-4o en riqueza absoluta.</w:t>
+        <w:rPr>
+          <w:b/>
+        </w:rPr>
+        <w:t>(E) Comparativa cross-model</w:t>
+      </w:r>
+      <w:r>
+        <w:t xml:space="preserve"> (§10) entre modelo cerrado (gpt-4o) y dos open-source (Llama 3.1 8B, Qwen 2.5 Coder 7B). Resultado contraintuitivo: en E2 el modelo pequeño supera al grande en OQuaRE, porque la rúbrica penaliza la complejidad. La comparación cualitativa de §8 sigue dando ventaja a gpt-4o en riqueza absoluta.</w:t>
       </w:r>
     </w:p>
     <w:p>
@@ -206,7 +236,13 @@
         <w:pStyle w:val="ListBullet"/>
       </w:pPr>
       <w:r>
-        <w:t>**(E) RAG semántico real** sustituye al keyword-match estático del experimento original (§10.7). Subo el OQuaRE de E3 con gpt-4o de 2.91 a 4.20 (+44 %). Para Llama el efecto es opuesto hasta calibrar top_k=2, momento en el que el 76 % del gap modelo-cerrado se cierra (§10.7.7). La calibración constituye una guía operativa cuantitativa, no una recomendación cualitativa.</w:t>
+        <w:rPr>
+          <w:b/>
+        </w:rPr>
+        <w:t>(E) RAG semántico real</w:t>
+      </w:r>
+      <w:r>
+        <w:t xml:space="preserve"> sustituye al keyword-match estático del experimento original (§10.7). Subo el OQuaRE de E3 con gpt-4o de 2.91 a 4.20 (+44 %). Para Llama el efecto es opuesto hasta calibrar top_k=2, momento en el que el 76 % del gap modelo-cerrado se cierra (§10.7.7). La calibración constituye una guía operativa cuantitativa, no una recomendación cualitativa.</w:t>
       </w:r>
     </w:p>
     <w:p>
@@ -227,7 +263,13 @@
         <w:pStyle w:val="ListBullet"/>
       </w:pPr>
       <w:r>
-        <w:t>**No prueba que un LLM pueda sustituir a un ontólogo en producción**. Las ontologías generadas necesitan revisión humana para uso real. El TFM mide cuánto trabajo ahorra el LLM, no si el resultado es publicable.</w:t>
+        <w:rPr>
+          <w:b/>
+        </w:rPr>
+        <w:t>No prueba que un LLM pueda sustituir a un ontólogo en producción</w:t>
+      </w:r>
+      <w:r>
+        <w:t>. Las ontologías generadas necesitan revisión humana para uso real. El TFM mide cuánto trabajo ahorra el LLM, no si el resultado es publicable.</w:t>
       </w:r>
     </w:p>
     <w:p>
@@ -235,7 +277,13 @@
         <w:pStyle w:val="ListBullet"/>
       </w:pPr>
       <w:r>
-        <w:t>**No es generalizable a otros dominios sin replicación**. Todos los experimentos usan bases de datos cis-regulatorias humanas. Un dominio con vocabulario más amplio (clinical trials, drug-target) podría dar otra distribución de errores y otro ranking entre modelos.</w:t>
+        <w:rPr>
+          <w:b/>
+        </w:rPr>
+        <w:t>No es generalizable a otros dominios sin replicación</w:t>
+      </w:r>
+      <w:r>
+        <w:t>. Todos los experimentos usan bases de datos cis-regulatorias humanas. Un dominio con vocabulario más amplio (clinical trials, drug-target) podría dar otra distribución de errores y otro ranking entre modelos.</w:t>
       </w:r>
     </w:p>
     <w:p>
@@ -243,7 +291,13 @@
         <w:pStyle w:val="ListBullet"/>
       </w:pPr>
       <w:r>
-        <w:t>**No evalúa la calidad de las relaciones inferidas**. OQuaRE y sus 11 métricas estructurales miden la forma del esquema, no la corrección biomédica de las clases que declara. Para eso haría falta validación experta sobre una muestra.</w:t>
+        <w:rPr>
+          <w:b/>
+        </w:rPr>
+        <w:t>No evalúa la calidad de las relaciones inferidas</w:t>
+      </w:r>
+      <w:r>
+        <w:t>. OQuaRE y sus 11 métricas estructurales miden la forma del esquema, no la corrección biomédica de las clases que declara. Para eso haría falta validación experta sobre una muestra.</w:t>
       </w:r>
     </w:p>
     <w:p>
@@ -251,7 +305,13 @@
         <w:pStyle w:val="ListBullet"/>
       </w:pPr>
       <w:r>
-        <w:t>**No es 100 % reproducible bit-a-bit**. OpenAI no garantiza determinismo, aunque la temperatura sea 0 y la seed esté fijada. El TFM admite la limitación y la encuadra en el marco de reproducibilidad de §12.</w:t>
+        <w:rPr>
+          <w:b/>
+        </w:rPr>
+        <w:t>No es 100 % reproducible bit-a-bit</w:t>
+      </w:r>
+      <w:r>
+        <w:t>. OpenAI no garantiza determinismo, aunque la temperatura sea 0 y la seed esté fijada. El TFM admite la limitación y la encuadra en el marco de reproducibilidad de §12.</w:t>
       </w:r>
     </w:p>
     <w:p>
@@ -2696,12 +2756,12 @@
             <w:vAlign w:val="center"/>
           </w:tcPr>
           <w:p>
-            <w:r/>
-            <w:r>
-              <w:rPr>
-                <w:sz w:val="20"/>
-              </w:rPr>
-              <w:t>**4.07**</w:t>
+            <w:r>
+              <w:rPr>
+                <w:b/>
+                <w:sz w:val="20"/>
+              </w:rPr>
+              <w:t>4.07</w:t>
             </w:r>
           </w:p>
         </w:tc>
@@ -2791,12 +2851,12 @@
             <w:vAlign w:val="center"/>
           </w:tcPr>
           <w:p>
-            <w:r/>
-            <w:r>
-              <w:rPr>
-                <w:sz w:val="20"/>
-              </w:rPr>
-              <w:t>**4.17**</w:t>
+            <w:r>
+              <w:rPr>
+                <w:b/>
+                <w:sz w:val="20"/>
+              </w:rPr>
+              <w:t>4.17</w:t>
             </w:r>
           </w:p>
         </w:tc>
@@ -2807,12 +2867,12 @@
             <w:vAlign w:val="center"/>
           </w:tcPr>
           <w:p>
-            <w:r/>
-            <w:r>
-              <w:rPr>
-                <w:sz w:val="20"/>
-              </w:rPr>
-              <w:t>**4.17**</w:t>
+            <w:r>
+              <w:rPr>
+                <w:b/>
+                <w:sz w:val="20"/>
+              </w:rPr>
+              <w:t>4.17</w:t>
             </w:r>
           </w:p>
         </w:tc>
@@ -2916,12 +2976,12 @@
             <w:vAlign w:val="center"/>
           </w:tcPr>
           <w:p>
-            <w:r/>
-            <w:r>
-              <w:rPr>
-                <w:sz w:val="20"/>
-              </w:rPr>
-              <w:t>**4.60**</w:t>
+            <w:r>
+              <w:rPr>
+                <w:b/>
+                <w:sz w:val="20"/>
+              </w:rPr>
+              <w:t>4.60</w:t>
             </w:r>
           </w:p>
         </w:tc>
@@ -2960,7 +3020,13 @@
         <w:pStyle w:val="ListBullet"/>
       </w:pPr>
       <w:r>
-        <w:t>**A_head es la estrategia menos favorable** en ambos experimentos con gpt-4o (3.78 en E1, 3.85 en E4). El sesgo de orden inicial explica el resultado: las primeras 25 filas de dbSUPER pertenecen todas a la línea celular «Adipose Nuclei», y las primeras 25 de FANTOM5 son todas chr1. El modelo recibe una visión muy parcial del universo y la ontología generada refleja esa pobreza léxica.</w:t>
+        <w:rPr>
+          <w:b/>
+        </w:rPr>
+        <w:t>A_head es la estrategia menos favorable</w:t>
+      </w:r>
+      <w:r>
+        <w:t xml:space="preserve"> en ambos experimentos con gpt-4o (3.78 en E1, 3.85 en E4). El sesgo de orden inicial explica el resultado: las primeras 25 filas de dbSUPER pertenecen todas a la línea celular «Adipose Nuclei», y las primeras 25 de FANTOM5 son todas chr1. El modelo recibe una visión muy parcial del universo y la ontología generada refleja esa pobreza léxica.</w:t>
       </w:r>
     </w:p>
     <w:p>
@@ -2968,7 +3034,13 @@
         <w:pStyle w:val="ListBullet"/>
       </w:pPr>
       <w:r>
-        <w:t>**B_random y C_stratified maximizan los scores OQuaRE** (diferencia de +0.29-0.32 puntos respecto a A_head, ~7-8% del rango aceptable). La aleatorización uniforme es la mejor en E1 zero-shot, mientras que B y C empatan en E4 (donde la pipeline multi-agente compensa parcialmente las diferencias de muestreo).</w:t>
+        <w:rPr>
+          <w:b/>
+        </w:rPr>
+        <w:t>B_random y C_stratified maximizan los scores OQuaRE</w:t>
+      </w:r>
+      <w:r>
+        <w:t xml:space="preserve"> (diferencia de +0.29-0.32 puntos respecto a A_head, ~7-8% del rango aceptable). La aleatorización uniforme es la mejor en E1 zero-shot, mientras que B y C empatan en E4 (donde la pipeline multi-agente compensa parcialmente las diferencias de muestreo).</w:t>
       </w:r>
     </w:p>
     <w:p>
@@ -2976,7 +3048,13 @@
         <w:pStyle w:val="ListBullet"/>
       </w:pPr>
       <w:r>
-        <w:t>**Llama 3.1 8B es muy sensible al muestreo**: A_head y B_random producen TTL irrecuperables (no validan en owlready2 incluso tras el post-procesado). Solo las estrategias con cobertura alta (C, D) generan ontologías válidas. Este es un finding complementario al §10.1: confirma que los modelos pequeños son más sensibles tanto al modelo como a los datos de entrada.</w:t>
+        <w:rPr>
+          <w:b/>
+        </w:rPr>
+        <w:t>Llama 3.1 8B es muy sensible al muestreo</w:t>
+      </w:r>
+      <w:r>
+        <w:t>: A_head y B_random producen TTL irrecuperables (no validan en owlready2 incluso tras el post-procesado). Solo las estrategias con cobertura alta (C, D) generan ontologías válidas. Este es un finding complementario al §10.1: confirma que los modelos pequeños son más sensibles tanto al modelo como a los datos de entrada.</w:t>
       </w:r>
     </w:p>
     <w:p>
@@ -2984,7 +3062,13 @@
         <w:pStyle w:val="ListBullet"/>
       </w:pPr>
       <w:r>
-        <w:t>**El TFM mantiene robustez cualitativa**: con cualquier estrategia, todas las celdas evaluadas permanecen por encima del umbral OQuaRE 3.0 «aceptable». Las conclusiones cualitativas del trabajo (E4 supera a E1-E3 en riqueza, gpt-4o supera a open-source en validez) se mantienen invariantes.</w:t>
+        <w:rPr>
+          <w:b/>
+        </w:rPr>
+        <w:t>El TFM mantiene robustez cualitativa</w:t>
+      </w:r>
+      <w:r>
+        <w:t>: con cualquier estrategia, todas las celdas evaluadas permanecen por encima del umbral OQuaRE 3.0 «aceptable». Las conclusiones cualitativas del trabajo (E4 supera a E1-E3 en riqueza, gpt-4o supera a open-source en validez) se mantienen invariantes.</w:t>
       </w:r>
     </w:p>
     <w:p>
@@ -3005,7 +3089,13 @@
         <w:pStyle w:val="ListBullet"/>
       </w:pPr>
       <w:r>
-        <w:t>**Reproducibilidad**: A es completamente determinista; B introduce variabilidad inter-corrida que requeriría reportar intervalos de confianza para cada métrica.</w:t>
+        <w:rPr>
+          <w:b/>
+        </w:rPr>
+        <w:t>Reproducibilidad</w:t>
+      </w:r>
+      <w:r>
+        <w:t>: A es completamente determinista; B introduce variabilidad inter-corrida que requeriría reportar intervalos de confianza para cada métrica.</w:t>
       </w:r>
     </w:p>
     <w:p>
@@ -3013,7 +3103,13 @@
         <w:pStyle w:val="ListBullet"/>
       </w:pPr>
       <w:r>
-        <w:t>**Consistencia con OntoGenix**: el pipeline original de Val Calvo et al. (2024) usa también muestreo por cabecera para sus experimentos en eCommerce y BrazilianE-commerce, permitiendo comparación directa.</w:t>
+        <w:rPr>
+          <w:b/>
+        </w:rPr>
+        <w:t>Consistencia con OntoGenix</w:t>
+      </w:r>
+      <w:r>
+        <w:t>: el pipeline original de Val Calvo et al. (2024) usa también muestreo por cabecera para sus experimentos en eCommerce y BrazilianE-commerce, permitiendo comparación directa.</w:t>
       </w:r>
     </w:p>
     <w:p>
@@ -3021,7 +3117,13 @@
         <w:pStyle w:val="ListBullet"/>
       </w:pPr>
       <w:r>
-        <w:t>**Coste computacional**: A no requiere preprocesado adicional ni cálculo de embeddings (D) ni pasada de conteo categórico (C).</w:t>
+        <w:rPr>
+          <w:b/>
+        </w:rPr>
+        <w:t>Coste computacional</w:t>
+      </w:r>
+      <w:r>
+        <w:t>: A no requiere preprocesado adicional ni cálculo de embeddings (D) ni pasada de conteo categórico (C).</w:t>
       </w:r>
     </w:p>
     <w:p>
@@ -3029,7 +3131,13 @@
         <w:pStyle w:val="ListBullet"/>
       </w:pPr>
       <w:r>
-        <w:t>**Robustez de las conclusiones**: el análisis de sensibilidad demuestra que, aunque A es subóptima en términos absolutos (~7-8% por debajo del óptimo), las conclusiones cualitativas se mantienen.</w:t>
+        <w:rPr>
+          <w:b/>
+        </w:rPr>
+        <w:t>Robustez de las conclusiones</w:t>
+      </w:r>
+      <w:r>
+        <w:t>: el análisis de sensibilidad demuestra que, aunque A es subóptima en términos absolutos (~7-8% por debajo del óptimo), las conclusiones cualitativas se mantienen.</w:t>
       </w:r>
     </w:p>
     <w:p>
@@ -7510,7 +7618,13 @@
         <w:pStyle w:val="ListBullet"/>
       </w:pPr>
       <w:r>
-        <w:t>**Métricas estructurales** calculadas con owlready2 sobre el grafo RDF: WMCOnto (complejidad por clase), NOMOnto (propiedades por clase), DITM (profundidad del árbol de herencia), NACOnto (clases ancestro promedio), CBOnto (acoplamiento), TMOnto (tangledness), LCOMOnto (cohesión), ANOnto (anotaciones por clase), INROnto (subclases por clase), RROnto y AROnto (riqueza de relaciones).</w:t>
+        <w:rPr>
+          <w:b/>
+        </w:rPr>
+        <w:t>Métricas estructurales</w:t>
+      </w:r>
+      <w:r>
+        <w:t xml:space="preserve"> calculadas con owlready2 sobre el grafo RDF: WMCOnto (complejidad por clase), NOMOnto (propiedades por clase), DITM (profundidad del árbol de herencia), NACOnto (clases ancestro promedio), CBOnto (acoplamiento), TMOnto (tangledness), LCOMOnto (cohesión), ANOnto (anotaciones por clase), INROnto (subclases por clase), RROnto y AROnto (riqueza de relaciones).</w:t>
       </w:r>
     </w:p>
     <w:p>
@@ -7518,7 +7632,13 @@
         <w:pStyle w:val="ListBullet"/>
       </w:pPr>
       <w:r>
-        <w:t>**Métricas con razonador** vía HermiT (incluido en owlready2): consistencia OWL DL, número de clases insatisfacibles y tiempo de clasificación. Estas alimentan la sub-característica «Reliability».</w:t>
+        <w:rPr>
+          <w:b/>
+        </w:rPr>
+        <w:t>Métricas con razonador</w:t>
+      </w:r>
+      <w:r>
+        <w:t xml:space="preserve"> vía HermiT (incluido en owlready2): consistencia OWL DL, número de clases insatisfacibles y tiempo de clasificación. Estas alimentan la sub-característica «Reliability».</w:t>
       </w:r>
     </w:p>
     <w:p>
@@ -7539,7 +7659,13 @@
         <w:pStyle w:val="ListBullet"/>
       </w:pPr>
       <w:r>
-        <w:t>**Saneo textual del TTL** mediante regex: detecta literales tipados como xsd:integer/decimal/boolean/etc. cuyo lexical no es convertible (p.ej. "start_position"^^xsd:integer) y los reescribe como xsd:string. Estos errores son característicos de modelos pequeños que copian la estructura del esquema pero confunden el placeholder del campo con su valor.</w:t>
+        <w:rPr>
+          <w:b/>
+        </w:rPr>
+        <w:t>Saneo textual del TTL</w:t>
+      </w:r>
+      <w:r>
+        <w:t xml:space="preserve"> mediante regex: detecta literales tipados como xsd:integer/decimal/boolean/etc. cuyo lexical no es convertible (p.ej. "start_position"^^xsd:integer) y los reescribe como xsd:string. Estos errores son característicos de modelos pequeños que copian la estructura del esquema pero confunden el placeholder del campo con su valor.</w:t>
       </w:r>
     </w:p>
     <w:p>
@@ -7547,7 +7673,13 @@
         <w:pStyle w:val="ListBullet"/>
       </w:pPr>
       <w:r>
-        <w:t>**Saneo a nivel de grafo** como red de seguridad: tras el parse, se vuelve a comprobar que no quedan literales mal tipados. El número de literales saneados por archivo se registra en la columna n_literals_sanitized del CSV y se usa como métrica adicional de calidad cualitativa.</w:t>
+        <w:rPr>
+          <w:b/>
+        </w:rPr>
+        <w:t>Saneo a nivel de grafo</w:t>
+      </w:r>
+      <w:r>
+        <w:t xml:space="preserve"> como red de seguridad: tras el parse, se vuelve a comprobar que no quedan literales mal tipados. El número de literales saneados por archivo se registra en la columna n_literals_sanitized del CSV y se usa como métrica adicional de calidad cualitativa.</w:t>
       </w:r>
     </w:p>
     <w:p>
@@ -8013,7 +8145,13 @@
         <w:pStyle w:val="ListBullet"/>
       </w:pPr>
       <w:r>
-        <w:t>**Llama 3.1 8B Instruct** (Meta) — modelo generalista, ~4.7 GB. Representa el baseline open-source de propósito general.</w:t>
+        <w:rPr>
+          <w:b/>
+        </w:rPr>
+        <w:t>Llama 3.1 8B Instruct</w:t>
+      </w:r>
+      <w:r>
+        <w:t xml:space="preserve"> (Meta) — modelo generalista, ~4.7 GB. Representa el baseline open-source de propósito general.</w:t>
       </w:r>
     </w:p>
     <w:p>
@@ -8021,7 +8159,13 @@
         <w:pStyle w:val="ListBullet"/>
       </w:pPr>
       <w:r>
-        <w:t>**Qwen 2.5 Coder 7B** (Alibaba) — modelo de tamaño comparable a Llama, pero entrenado con énfasis en generación de código. La hipótesis es que la especialización en código debería traducirse en mejor sintaxis Turtle.</w:t>
+        <w:rPr>
+          <w:b/>
+        </w:rPr>
+        <w:t>Qwen 2.5 Coder 7B</w:t>
+      </w:r>
+      <w:r>
+        <w:t xml:space="preserve"> (Alibaba) — modelo de tamaño comparable a Llama, pero entrenado con énfasis en generación de código. La hipótesis es que la especialización en código debería traducirse en mejor sintaxis Turtle.</w:t>
       </w:r>
     </w:p>
     <w:p>
@@ -8460,7 +8604,16 @@
     </w:p>
     <w:p>
       <w:r>
-        <w:t>Este resultado, refinado por la inclusión de Qwen, lleva a una conclusión más precisa que la formulada en la versión anterior del trabajo: el patrón de alucinación tipada **no depende del modelo concreto sino del binomio RAG + modelo pequeño**. Tanto Llama (generalista) como Qwen (especializado en código) producen exactamente el mismo número de errores y de la misma naturaleza. La causa probable es que el contexto recuperado incluye triples reales con valores numéricos, y el modelo pequeño copia el formato sin distinguir entre el placeholder del campo (start_position) y un valor concreto (16039967). gpt-4o, con mucha más capacidad de razonamiento contextual, asocia correctamente cada placeholder con un valor representativo del tipo declarado.</w:t>
+        <w:t xml:space="preserve">Este resultado, refinado por la inclusión de Qwen, lleva a una conclusión más precisa que la formulada en la versión anterior del trabajo: el patrón de alucinación tipada </w:t>
+      </w:r>
+      <w:r>
+        <w:rPr>
+          <w:b/>
+        </w:rPr>
+        <w:t>no depende del modelo concreto sino del binomio RAG + modelo pequeño</w:t>
+      </w:r>
+      <w:r>
+        <w:t>. Tanto Llama (generalista) como Qwen (especializado en código) producen exactamente el mismo número de errores y de la misma naturaleza. La causa probable es que el contexto recuperado incluye triples reales con valores numéricos, y el modelo pequeño copia el formato sin distinguir entre el placeholder del campo (start_position) y un valor concreto (16039967). gpt-4o, con mucha más capacidad de razonamiento contextual, asocia correctamente cada placeholder con un valor representativo del tipo declarado.</w:t>
       </w:r>
     </w:p>
     <w:p>
@@ -8881,7 +9034,34 @@
     </w:p>
     <w:p>
       <w:r>
-        <w:t>Tres observaciones de esta tabla. **Primera**: en E2 y E3, los modelos open-source alcanzan o superan a gpt-4o (Llama 4.40 y Qwen 4.00 en E2 frente a 3.98 de gpt-4o; Llama 3.48 y Qwen 3.45 en E3 frente a 2.92 de gpt-4o). **Segunda**: la diferencia entre Llama y Qwen es muy pequeña (≤ 0.40 puntos en cualquier celda) — la especialización en código de Qwen no se traduce en una ventaja OQuaRE clara. **Tercera**: gpt-4o es el único modelo capaz de producir ontologías válidas en E1 sin post-procesado severo, lo cual mantiene su valor como baseline robusto.</w:t>
+        <w:t xml:space="preserve">Tres observaciones de esta tabla. </w:t>
+      </w:r>
+      <w:r>
+        <w:rPr>
+          <w:b/>
+        </w:rPr>
+        <w:t>Primera</w:t>
+      </w:r>
+      <w:r>
+        <w:t xml:space="preserve">: en E2 y E3, los modelos open-source alcanzan o superan a gpt-4o (Llama 4.40 y Qwen 4.00 en E2 frente a 3.98 de gpt-4o; Llama 3.48 y Qwen 3.45 en E3 frente a 2.92 de gpt-4o). </w:t>
+      </w:r>
+      <w:r>
+        <w:rPr>
+          <w:b/>
+        </w:rPr>
+        <w:t>Segunda</w:t>
+      </w:r>
+      <w:r>
+        <w:t xml:space="preserve">: la diferencia entre Llama y Qwen es muy pequeña (≤ 0.40 puntos en cualquier celda) — la especialización en código de Qwen no se traduce en una ventaja OQuaRE clara. </w:t>
+      </w:r>
+      <w:r>
+        <w:rPr>
+          <w:b/>
+        </w:rPr>
+        <w:t>Tercera</w:t>
+      </w:r>
+      <w:r>
+        <w:t>: gpt-4o es el único modelo capaz de producir ontologías válidas en E1 sin post-procesado severo, lo cual mantiene su valor como baseline robusto.</w:t>
       </w:r>
     </w:p>
     <w:p>
@@ -8899,7 +9079,16 @@
     </w:p>
     <w:p>
       <w:r>
-        <w:t>Esto no debe interpretarse como que los modelos open-source produzcan «mejores ontologías» que OntoGenix; significa que **OQuaRE y riqueza semántica son dimensiones complementarias**, no equivalentes. Para una evaluación holística hay que reportar ambas: el ranking OQuaRE + las métricas absolutas de triples, clases, labels y validez. Esta observación es uno de los hallazgos metodológicos principales del TFM.</w:t>
+        <w:t xml:space="preserve">Esto no debe interpretarse como que los modelos open-source produzcan «mejores ontologías» que OntoGenix; significa que </w:t>
+      </w:r>
+      <w:r>
+        <w:rPr>
+          <w:b/>
+        </w:rPr>
+        <w:t>OQuaRE y riqueza semántica son dimensiones complementarias</w:t>
+      </w:r>
+      <w:r>
+        <w:t>, no equivalentes. Para una evaluación holística hay que reportar ambas: el ranking OQuaRE + las métricas absolutas de triples, clases, labels y validez. Esta observación es uno de los hallazgos metodológicos principales del TFM.</w:t>
       </w:r>
     </w:p>
     <w:p>
@@ -9488,12 +9677,30 @@
     </w:p>
     <w:p>
       <w:r>
-        <w:t>Las ontologías producidas por la pipeline OntoGenix con llama3.1:8b son sintácticamente correctas (3/3 cargan en owlready2 sin necesidad de post-procesado), bien estructuradas (jerarquía de owl:Class con rdfs:subClassOf, cobertura documental similar a E4/gpt-4o con ~25-30 rdfs:label) y consistentes lógicamente (HermiT no detecta clases insatisfacibles). En este aspecto **el método multi-agente sí compensa la deficiencia sintáctica observada en E1-E3 con llama3.1:8b**: el modelo, guiado paso a paso por LlmPlanner → LlmOntology → LlmOntoMapper, deja de cometer errores como omitir el «:» del prefijo o mezclar sintaxis.</w:t>
+        <w:t xml:space="preserve">Las ontologías producidas por la pipeline OntoGenix con llama3.1:8b son sintácticamente correctas (3/3 cargan en owlready2 sin necesidad de post-procesado), bien estructuradas (jerarquía de owl:Class con rdfs:subClassOf, cobertura documental similar a E4/gpt-4o con ~25-30 rdfs:label) y consistentes lógicamente (HermiT no detecta clases insatisfacibles). En este aspecto </w:t>
+      </w:r>
+      <w:r>
+        <w:rPr>
+          <w:b/>
+        </w:rPr>
+        <w:t>el método multi-agente sí compensa la deficiencia sintáctica observada en E1-E3 con llama3.1:8b</w:t>
+      </w:r>
+      <w:r>
+        <w:t>: el modelo, guiado paso a paso por LlmPlanner → LlmOntology → LlmOntoMapper, deja de cometer errores como omitir el «:» del prefijo o mezclar sintaxis.</w:t>
       </w:r>
     </w:p>
     <w:p>
       <w:r>
-        <w:t>Sin embargo, **el método NO compensa la pobreza semántica**. Las ontologías generadas con llama3.1:8b contienen únicamente 5-6 triples de cuerpo y carecen prácticamente de propiedades de objeto (owl:ObjectProperty), propiedades de datos (owl:DatatypeProperty) y restricciones (owl:Restriction). Son esquemas válidos pero esqueléticos: una jerarquía de clases con etiquetas y comentarios, sin la malla relacional rica que produce gpt-4o (≈227 triples, ≈26 datatype properties, ≈10 subClassOf por ontología en E4).</w:t>
+        <w:t xml:space="preserve">Sin embargo, </w:t>
+      </w:r>
+      <w:r>
+        <w:rPr>
+          <w:b/>
+        </w:rPr>
+        <w:t>el método NO compensa la pobreza semántica</w:t>
+      </w:r>
+      <w:r>
+        <w:t>. Las ontologías generadas con llama3.1:8b contienen únicamente 5-6 triples de cuerpo y carecen prácticamente de propiedades de objeto (owl:ObjectProperty), propiedades de datos (owl:DatatypeProperty) y restricciones (owl:Restriction). Son esquemas válidos pero esqueléticos: una jerarquía de clases con etiquetas y comentarios, sin la malla relacional rica que produce gpt-4o (≈227 triples, ≈26 datatype properties, ≈10 subClassOf por ontología en E4).</w:t>
       </w:r>
     </w:p>
     <w:tbl>
@@ -10043,7 +10250,13 @@
     </w:tbl>
     <w:p>
       <w:r>
-        <w:t>**Conclusión del experimento extendido**. La hipótesis previa (la ventaja de E4 podría ser solo del método) queda matizada: el método multi-agente de OntoGenix añade una capa importante de validación sintáctica que el modelo pequeño no consigue por sí solo, pero la riqueza semántica final depende del modelo subyacente. Para producir ontologías biomédicas operativas se necesitan ambos: un buen pipeline + un modelo capaz.</w:t>
+        <w:rPr>
+          <w:b/>
+        </w:rPr>
+        <w:t>Conclusión del experimento extendido</w:t>
+      </w:r>
+      <w:r>
+        <w:t>. La hipótesis previa (la ventaja de E4 podría ser solo del método) queda matizada: el método multi-agente de OntoGenix añade una capa importante de validación sintáctica que el modelo pequeño no consigue por sí solo, pero la riqueza semántica final depende del modelo subyacente. Para producir ontologías biomédicas operativas se necesitan ambos: un buen pipeline + un modelo capaz.</w:t>
       </w:r>
     </w:p>
     <w:p>
@@ -11029,12 +11242,12 @@
             <w:vAlign w:val="center"/>
           </w:tcPr>
           <w:p>
-            <w:r/>
-            <w:r>
-              <w:rPr>
-                <w:sz w:val="20"/>
-              </w:rPr>
-              <w:t>**OQuaRE Global**</w:t>
+            <w:r>
+              <w:rPr>
+                <w:b/>
+                <w:sz w:val="20"/>
+              </w:rPr>
+              <w:t>OQuaRE Global</w:t>
             </w:r>
           </w:p>
         </w:tc>
@@ -11045,12 +11258,12 @@
             <w:vAlign w:val="center"/>
           </w:tcPr>
           <w:p>
-            <w:r/>
-            <w:r>
-              <w:rPr>
-                <w:sz w:val="20"/>
-              </w:rPr>
-              <w:t>**2.91**</w:t>
+            <w:r>
+              <w:rPr>
+                <w:b/>
+                <w:sz w:val="20"/>
+              </w:rPr>
+              <w:t>2.91</w:t>
             </w:r>
           </w:p>
         </w:tc>
@@ -11061,12 +11274,12 @@
             <w:vAlign w:val="center"/>
           </w:tcPr>
           <w:p>
-            <w:r/>
-            <w:r>
-              <w:rPr>
-                <w:sz w:val="20"/>
-              </w:rPr>
-              <w:t>**4.20**</w:t>
+            <w:r>
+              <w:rPr>
+                <w:b/>
+                <w:sz w:val="20"/>
+              </w:rPr>
+              <w:t>4.20</w:t>
             </w:r>
           </w:p>
         </w:tc>
@@ -11077,12 +11290,12 @@
             <w:vAlign w:val="center"/>
           </w:tcPr>
           <w:p>
-            <w:r/>
-            <w:r>
-              <w:rPr>
-                <w:sz w:val="20"/>
-              </w:rPr>
-              <w:t>**+1.29**</w:t>
+            <w:r>
+              <w:rPr>
+                <w:b/>
+                <w:sz w:val="20"/>
+              </w:rPr>
+              <w:t>+1.29</w:t>
             </w:r>
           </w:p>
         </w:tc>
@@ -11127,7 +11340,13 @@
         <w:pStyle w:val="ListBullet"/>
       </w:pPr>
       <w:r>
-        <w:t>**El cuello de botella de E3 era el retrieval, no el modelo.** gpt-4o ya tenía la capacidad de generar esquemas ricos; lo que le faltaba era el contexto adecuado.</w:t>
+        <w:rPr>
+          <w:b/>
+        </w:rPr>
+        <w:t>El cuello de botella de E3 era el retrieval, no el modelo.</w:t>
+      </w:r>
+      <w:r>
+        <w:t xml:space="preserve"> gpt-4o ya tenía la capacidad de generar esquemas ricos; lo que le faltaba era el contexto adecuado.</w:t>
       </w:r>
     </w:p>
     <w:p>
@@ -11135,7 +11354,13 @@
         <w:pStyle w:val="ListBullet"/>
       </w:pPr>
       <w:r>
-        <w:t>**La calidad del corpus indexado importa más que el tamaño.** Indexamos solo 21 ontologías y la mejora es drástica. La evidencia sugiere que escalar a corpus mayores (toda la BFO, OBI, GO, BioGateway completo) podría llevar el score a &gt;4.5.</w:t>
+        <w:rPr>
+          <w:b/>
+        </w:rPr>
+        <w:t>La calidad del corpus indexado importa más que el tamaño.</w:t>
+      </w:r>
+      <w:r>
+        <w:t xml:space="preserve"> Indexamos solo 21 ontologías y la mejora es drástica. La evidencia sugiere que escalar a corpus mayores (toda la BFO, OBI, GO, BioGateway completo) podría llevar el score a &gt;4.5.</w:t>
       </w:r>
     </w:p>
     <w:p>
@@ -11143,7 +11368,13 @@
         <w:pStyle w:val="ListBullet"/>
       </w:pPr>
       <w:r>
-        <w:t>**El RAG semántico cambia el orden del cuadro 4×3 del apartado 10.4.** Con el legacy, E3 era el peor experimento (2.92). Con el RAG semántico, E3 (4.20) supera a E1 zero-shot (3.89) y a E2 vocabulario (3.98), y casi alcanza a E4 OntoGenix (3.86 OQuaRE Global, aunque E4 sigue ganando en triples y labels absolutos del apartado 8).</w:t>
+        <w:rPr>
+          <w:b/>
+        </w:rPr>
+        <w:t>El RAG semántico cambia el orden del cuadro 4×3 del apartado 10.4.</w:t>
+      </w:r>
+      <w:r>
+        <w:t xml:space="preserve"> Con el legacy, E3 era el peor experimento (2.92). Con el RAG semántico, E3 (4.20) supera a E1 zero-shot (3.89) y a E2 vocabulario (3.98), y casi alcanza a E4 OntoGenix (3.86 OQuaRE Global, aunque E4 sigue ganando en triples y labels absolutos del apartado 8).</w:t>
       </w:r>
     </w:p>
     <w:p>
@@ -11347,12 +11578,18 @@
             <w:vAlign w:val="center"/>
           </w:tcPr>
           <w:p>
-            <w:r/>
-            <w:r>
-              <w:rPr>
-                <w:sz w:val="20"/>
-              </w:rPr>
-              <w:t>**Total** (sin contar la corrida de gpt-4o)</w:t>
+            <w:r>
+              <w:rPr>
+                <w:b/>
+                <w:sz w:val="20"/>
+              </w:rPr>
+              <w:t>Total</w:t>
+            </w:r>
+            <w:r>
+              <w:rPr>
+                <w:sz w:val="20"/>
+              </w:rPr>
+              <w:t xml:space="preserve"> (sin contar la corrida de gpt-4o)</w:t>
             </w:r>
           </w:p>
         </w:tc>
@@ -11362,12 +11599,12 @@
             <w:vAlign w:val="center"/>
           </w:tcPr>
           <w:p>
-            <w:r/>
-            <w:r>
-              <w:rPr>
-                <w:sz w:val="20"/>
-              </w:rPr>
-              <w:t>**~45 min**</w:t>
+            <w:r>
+              <w:rPr>
+                <w:b/>
+                <w:sz w:val="20"/>
+              </w:rPr>
+              <w:t>~45 min</w:t>
             </w:r>
           </w:p>
         </w:tc>
@@ -11570,12 +11807,12 @@
             <w:vAlign w:val="center"/>
           </w:tcPr>
           <w:p>
-            <w:r/>
-            <w:r>
-              <w:rPr>
-                <w:sz w:val="20"/>
-              </w:rPr>
-              <w:t>**gpt-4o**</w:t>
+            <w:r>
+              <w:rPr>
+                <w:b/>
+                <w:sz w:val="20"/>
+              </w:rPr>
+              <w:t>gpt-4o</w:t>
             </w:r>
           </w:p>
         </w:tc>
@@ -11600,12 +11837,12 @@
             <w:vAlign w:val="center"/>
           </w:tcPr>
           <w:p>
-            <w:r/>
-            <w:r>
-              <w:rPr>
-                <w:sz w:val="20"/>
-              </w:rPr>
-              <w:t>**4.20**</w:t>
+            <w:r>
+              <w:rPr>
+                <w:b/>
+                <w:sz w:val="20"/>
+              </w:rPr>
+              <w:t>4.20</w:t>
             </w:r>
           </w:p>
         </w:tc>
@@ -11615,12 +11852,12 @@
             <w:vAlign w:val="center"/>
           </w:tcPr>
           <w:p>
-            <w:r/>
-            <w:r>
-              <w:rPr>
-                <w:sz w:val="20"/>
-              </w:rPr>
-              <w:t>**+1.29**</w:t>
+            <w:r>
+              <w:rPr>
+                <w:b/>
+                <w:sz w:val="20"/>
+              </w:rPr>
+              <w:t>+1.29</w:t>
             </w:r>
           </w:p>
         </w:tc>
@@ -11648,12 +11885,12 @@
             <w:vAlign w:val="center"/>
           </w:tcPr>
           <w:p>
-            <w:r/>
-            <w:r>
-              <w:rPr>
-                <w:sz w:val="20"/>
-              </w:rPr>
-              <w:t>**llama3.1:8b**</w:t>
+            <w:r>
+              <w:rPr>
+                <w:b/>
+                <w:sz w:val="20"/>
+              </w:rPr>
+              <w:t>llama3.1:8b</w:t>
             </w:r>
           </w:p>
         </w:tc>
@@ -11736,7 +11973,13 @@
         <w:pStyle w:val="ListBullet"/>
       </w:pPr>
       <w:r>
-        <w:t>**El RAG semántico beneficia mucho más al modelo grande**: +1.29 puntos en gpt-4o frente a +0.24 en llama. Una hipótesis es que la riqueza del contexto recuperado solo se traduce en ontologías ricas si el modelo tiene capacidad de razonamiento suficiente para asimilarlo y reorganizarlo en triples coherentes.</w:t>
+        <w:rPr>
+          <w:b/>
+        </w:rPr>
+        <w:t>El RAG semántico beneficia mucho más al modelo grande</w:t>
+      </w:r>
+      <w:r>
+        <w:t>: +1.29 puntos en gpt-4o frente a +0.24 en llama. Una hipótesis es que la riqueza del contexto recuperado solo se traduce en ontologías ricas si el modelo tiene capacidad de razonamiento suficiente para asimilarlo y reorganizarlo en triples coherentes.</w:t>
       </w:r>
     </w:p>
     <w:p>
@@ -11744,7 +11987,31 @@
         <w:pStyle w:val="ListBullet"/>
       </w:pPr>
       <w:r>
-        <w:t>**Llama pierde la mitad de las corridas con RAG semántico** (6/12 válidas vs 12/12 en legacy). El contexto enriquecido le induce a inventar prefijos no declarados (`enhancer:`, `crmType:`, etc.) y produce TTL irrecuperables incluso tras post-procesado. Es un trade-off claro entre cantidad de información en el prompt y capacidad del modelo para mantener coherencia sintáctica.</w:t>
+        <w:rPr>
+          <w:b/>
+        </w:rPr>
+        <w:t>Llama pierde la mitad de las corridas con RAG semántico</w:t>
+      </w:r>
+      <w:r>
+        <w:t xml:space="preserve"> (6/12 válidas vs 12/12 en legacy). El contexto enriquecido le induce a inventar prefijos no declarados (</w:t>
+      </w:r>
+      <w:r>
+        <w:rPr>
+          <w:rFonts w:ascii="Consolas" w:hAnsi="Consolas"/>
+        </w:rPr>
+        <w:t>enhancer:</w:t>
+      </w:r>
+      <w:r>
+        <w:t xml:space="preserve">, </w:t>
+      </w:r>
+      <w:r>
+        <w:rPr>
+          <w:rFonts w:ascii="Consolas" w:hAnsi="Consolas"/>
+        </w:rPr>
+        <w:t>crmType:</w:t>
+      </w:r>
+      <w:r>
+        <w:t>, etc.) y produce TTL irrecuperables incluso tras post-procesado. Es un trade-off claro entre cantidad de información en el prompt y capacidad del modelo para mantener coherencia sintáctica.</w:t>
       </w:r>
     </w:p>
     <w:p>
@@ -11752,7 +12019,13 @@
         <w:pStyle w:val="ListBullet"/>
       </w:pPr>
       <w:r>
-        <w:t>**En las pocas corridas válidas, llama+RAG semántico mantiene Reliability=5.00** (las que validan son siempre consistentes en OWL DL) pero su Operability sube solo a 2.50, frente a los 4.95 que alcanza gpt-4o. Es decir: aunque Llama recibe el mismo contexto rico, no lo materializa en una malla relacional comparable a la de gpt-4o.</w:t>
+        <w:rPr>
+          <w:b/>
+        </w:rPr>
+        <w:t>En las pocas corridas válidas, llama+RAG semántico mantiene Reliability=5.00</w:t>
+      </w:r>
+      <w:r>
+        <w:t xml:space="preserve"> (las que validan son siempre consistentes en OWL DL) pero su Operability sube solo a 2.50, frente a los 4.95 que alcanza gpt-4o. Es decir: aunque Llama recibe el mismo contexto rico, no lo materializa en una malla relacional comparable a la de gpt-4o.</w:t>
       </w:r>
     </w:p>
     <w:p>
@@ -11760,12 +12033,27 @@
         <w:pStyle w:val="ListBullet"/>
       </w:pPr>
       <w:r>
-        <w:t>**Inversión cualitativa del ranking en legacy vs en RAG real**. Con backend legacy, llama3.1:8b (3.45) supera ligeramente a gpt-4o (2.91) por la regla observada en §10.5 (OQuaRE penaliza la complejidad y Llama produce esquemas más simples). Con RAG semántico, gpt-4o (4.20) supera a llama (3.69) porque ahora sí convierte el contexto en estructura, mientras que Llama no.</w:t>
+        <w:rPr>
+          <w:b/>
+        </w:rPr>
+        <w:t>Inversión cualitativa del ranking en legacy vs en RAG real</w:t>
+      </w:r>
+      <w:r>
+        <w:t>. Con backend legacy, llama3.1:8b (3.45) supera ligeramente a gpt-4o (2.91) por la regla observada en §10.5 (OQuaRE penaliza la complejidad y Llama produce esquemas más simples). Con RAG semántico, gpt-4o (4.20) supera a llama (3.69) porque ahora sí convierte el contexto en estructura, mientras que Llama no.</w:t>
       </w:r>
     </w:p>
     <w:p>
       <w:r>
-        <w:t>Este experimento de control refuerza una conclusión metodológica central del trabajo: **la efectividad del RAG no es una propiedad del retrieval por sí solo, sino de la interacción retrieval × modelo**. Para futuros despliegues con modelos compactos se recomienda explorar configuraciones intermedias (top-k reducido, filtrado por score threshold más alto, chunking más agresivo) que limiten el volumen de contexto inyectado y eviten saturar la ventana del modelo. La validación empírica de esta recomendación se aborda en §10.7.7.</w:t>
+        <w:t xml:space="preserve">Este experimento de control refuerza una conclusión metodológica central del trabajo: </w:t>
+      </w:r>
+      <w:r>
+        <w:rPr>
+          <w:b/>
+        </w:rPr>
+        <w:t>la efectividad del RAG no es una propiedad del retrieval por sí solo, sino de la interacción retrieval × modelo</w:t>
+      </w:r>
+      <w:r>
+        <w:t>. Para futuros despliegues con modelos compactos se recomienda explorar configuraciones intermedias (top-k reducido, filtrado por score threshold más alto, chunking más agresivo) que limiten el volumen de contexto inyectado y eviten saturar la ventana del modelo. La validación empírica de esta recomendación se aborda en §10.7.7.</w:t>
       </w:r>
     </w:p>
     <w:p>
@@ -12075,12 +12363,12 @@
             <w:vAlign w:val="center"/>
           </w:tcPr>
           <w:p>
-            <w:r/>
-            <w:r>
-              <w:rPr>
-                <w:sz w:val="20"/>
-              </w:rPr>
-              <w:t>**C1 — top-k reducido**</w:t>
+            <w:r>
+              <w:rPr>
+                <w:b/>
+                <w:sz w:val="20"/>
+              </w:rPr>
+              <w:t>C1 — top-k reducido</w:t>
             </w:r>
           </w:p>
         </w:tc>
@@ -12090,12 +12378,12 @@
             <w:vAlign w:val="center"/>
           </w:tcPr>
           <w:p>
-            <w:r/>
-            <w:r>
-              <w:rPr>
-                <w:sz w:val="20"/>
-              </w:rPr>
-              <w:t>**2**</w:t>
+            <w:r>
+              <w:rPr>
+                <w:b/>
+                <w:sz w:val="20"/>
+              </w:rPr>
+              <w:t>2</w:t>
             </w:r>
           </w:p>
         </w:tc>
@@ -12185,12 +12473,12 @@
             <w:vAlign w:val="center"/>
           </w:tcPr>
           <w:p>
-            <w:r/>
-            <w:r>
-              <w:rPr>
-                <w:sz w:val="20"/>
-              </w:rPr>
-              <w:t>**0.60**</w:t>
+            <w:r>
+              <w:rPr>
+                <w:b/>
+                <w:sz w:val="20"/>
+              </w:rPr>
+              <w:t>0.60</w:t>
             </w:r>
           </w:p>
         </w:tc>
@@ -12249,12 +12537,12 @@
             <w:vAlign w:val="center"/>
           </w:tcPr>
           <w:p>
-            <w:r/>
-            <w:r>
-              <w:rPr>
-                <w:sz w:val="20"/>
-              </w:rPr>
-              <w:t>**2**</w:t>
+            <w:r>
+              <w:rPr>
+                <w:b/>
+                <w:sz w:val="20"/>
+              </w:rPr>
+              <w:t>2</w:t>
             </w:r>
           </w:p>
         </w:tc>
@@ -12264,12 +12552,12 @@
             <w:vAlign w:val="center"/>
           </w:tcPr>
           <w:p>
-            <w:r/>
-            <w:r>
-              <w:rPr>
-                <w:sz w:val="20"/>
-              </w:rPr>
-              <w:t>**0.60**</w:t>
+            <w:r>
+              <w:rPr>
+                <w:b/>
+                <w:sz w:val="20"/>
+              </w:rPr>
+              <w:t>0.60</w:t>
             </w:r>
           </w:p>
         </w:tc>
@@ -12279,12 +12567,12 @@
             <w:vAlign w:val="center"/>
           </w:tcPr>
           <w:p>
-            <w:r/>
-            <w:r>
-              <w:rPr>
-                <w:sz w:val="20"/>
-              </w:rPr>
-              <w:t>**2000**</w:t>
+            <w:r>
+              <w:rPr>
+                <w:b/>
+                <w:sz w:val="20"/>
+              </w:rPr>
+              <w:t>2000</w:t>
             </w:r>
           </w:p>
         </w:tc>
@@ -12545,14 +12833,13 @@
             <w:pPr>
               <w:jc w:val="center"/>
             </w:pPr>
-            <w:r/>
             <w:r>
               <w:rPr>
                 <w:b/>
                 <w:color w:val="FFFFFF"/>
                 <w:sz w:val="20"/>
               </w:rPr>
-              <w:t>**Global**</w:t>
+              <w:t>Global</w:t>
             </w:r>
           </w:p>
         </w:tc>
@@ -12816,12 +13103,12 @@
             <w:vAlign w:val="center"/>
           </w:tcPr>
           <w:p>
-            <w:r/>
-            <w:r>
-              <w:rPr>
-                <w:sz w:val="20"/>
-              </w:rPr>
-              <w:t>**C1 — top-k=2**</w:t>
+            <w:r>
+              <w:rPr>
+                <w:b/>
+                <w:sz w:val="20"/>
+              </w:rPr>
+              <w:t>C1 — top-k=2</w:t>
             </w:r>
           </w:p>
         </w:tc>
@@ -12831,12 +13118,12 @@
             <w:vAlign w:val="center"/>
           </w:tcPr>
           <w:p>
-            <w:r/>
-            <w:r>
-              <w:rPr>
-                <w:sz w:val="20"/>
-              </w:rPr>
-              <w:t>**6/12**</w:t>
+            <w:r>
+              <w:rPr>
+                <w:b/>
+                <w:sz w:val="20"/>
+              </w:rPr>
+              <w:t>6/12</w:t>
             </w:r>
           </w:p>
         </w:tc>
@@ -12891,12 +13178,12 @@
             <w:vAlign w:val="center"/>
           </w:tcPr>
           <w:p>
-            <w:r/>
-            <w:r>
-              <w:rPr>
-                <w:sz w:val="20"/>
-              </w:rPr>
-              <w:t>**4.25**</w:t>
+            <w:r>
+              <w:rPr>
+                <w:b/>
+                <w:sz w:val="20"/>
+              </w:rPr>
+              <w:t>4.25</w:t>
             </w:r>
           </w:p>
         </w:tc>
@@ -12921,12 +13208,12 @@
             <w:vAlign w:val="center"/>
           </w:tcPr>
           <w:p>
-            <w:r/>
-            <w:r>
-              <w:rPr>
-                <w:sz w:val="20"/>
-              </w:rPr>
-              <w:t>**4.08**</w:t>
+            <w:r>
+              <w:rPr>
+                <w:b/>
+                <w:sz w:val="20"/>
+              </w:rPr>
+              <w:t>4.08</w:t>
             </w:r>
           </w:p>
         </w:tc>
@@ -13197,7 +13484,13 @@
         <w:pStyle w:val="ListBullet"/>
       </w:pPr>
       <w:r>
-        <w:t>**C1 (top-k reducido) es la configuración óptima**: 4.08 OQuaRE Global, +0.39 sobre el baseline ragapi y +0.63 sobre legacy. Mantiene el mismo número de runs válidas que el baseline (6/12) pero la calidad de las que sí validan es muy superior, destacando una mejora ×1.7 en Operability (4.25 vs 2.50).</w:t>
+        <w:rPr>
+          <w:b/>
+        </w:rPr>
+        <w:t>C1 (top-k reducido) es la configuración óptima</w:t>
+      </w:r>
+      <w:r>
+        <w:t>: 4.08 OQuaRE Global, +0.39 sobre el baseline ragapi y +0.63 sobre legacy. Mantiene el mismo número de runs válidas que el baseline (6/12) pero la calidad de las que sí validan es muy superior, destacando una mejora ×1.7 en Operability (4.25 vs 2.50).</w:t>
       </w:r>
     </w:p>
     <w:p>
@@ -13205,7 +13498,13 @@
         <w:pStyle w:val="ListBullet"/>
       </w:pPr>
       <w:r>
-        <w:t>**El top_k es la palanca crítica**, no el score threshold ni el recorte de contexto. C2 (score_thr=0.6) gana solo +0.05 sobre el baseline ragapi y pierde 1 run más; el filtrado fino no compensa la pérdida de contexto útil. C3 (combinación agresiva) rescata más runs (7/12) pero su Global cae a 3.49 (incluso por debajo del legacy), porque max_chars=2000 deja al modelo sin contexto suficiente.</w:t>
+        <w:rPr>
+          <w:b/>
+        </w:rPr>
+        <w:t>El top_k es la palanca crítica</w:t>
+      </w:r>
+      <w:r>
+        <w:t>, no el score threshold ni el recorte de contexto. C2 (score_thr=0.6) gana solo +0.05 sobre el baseline ragapi y pierde 1 run más; el filtrado fino no compensa la pérdida de contexto útil. C3 (combinación agresiva) rescata más runs (7/12) pero su Global cae a 3.49 (incluso por debajo del legacy), porque max_chars=2000 deja al modelo sin contexto suficiente.</w:t>
       </w:r>
     </w:p>
     <w:p>
@@ -13213,7 +13512,22 @@
         <w:pStyle w:val="ListBullet"/>
       </w:pPr>
       <w:r>
-        <w:t>**Hipótesis confirmada con matiz**. La afirmación general de §10.7.6 ("configuraciones intermedias mejoran a los modelos compactos") se valida, pero el experimento revela que el mecanismo causal específico es **reducir el número de ontologías recuperadas**, no "limpiar" su contenido vía score threshold ni truncar el prompt resultante. Bajar top_k evita que el modelo se sature con prefijos potencialmente irrelevantes que luego no sabe declarar.</w:t>
+        <w:rPr>
+          <w:b/>
+        </w:rPr>
+        <w:t>Hipótesis confirmada con matiz</w:t>
+      </w:r>
+      <w:r>
+        <w:t xml:space="preserve">. La afirmación general de §10.7.6 ("configuraciones intermedias mejoran a los modelos compactos") se valida, pero el experimento revela que el mecanismo causal específico es </w:t>
+      </w:r>
+      <w:r>
+        <w:rPr>
+          <w:b/>
+        </w:rPr>
+        <w:t>reducir el número de ontologías recuperadas</w:t>
+      </w:r>
+      <w:r>
+        <w:t>, no "limpiar" su contenido vía score threshold ni truncar el prompt resultante. Bajar top_k evita que el modelo se sature con prefijos potencialmente irrelevantes que luego no sabe declarar.</w:t>
       </w:r>
     </w:p>
     <w:p>
@@ -13221,7 +13535,22 @@
         <w:pStyle w:val="ListBullet"/>
       </w:pPr>
       <w:r>
-        <w:t>**El gap respecto a gpt-4o no se cierra del todo**. C1 (4.08) sigue por debajo de gpt-4o + RAG semántico (4.20 según §10.7.3). Pero la diferencia se reduce de 0.51 puntos (con configuración estándar) a 0.12 puntos (con C1). **Aproximadamente el 76 % del gap se cierra con un único cambio de un parámetro**, sin tocar el modelo ni el prompt.</w:t>
+        <w:rPr>
+          <w:b/>
+        </w:rPr>
+        <w:t>El gap respecto a gpt-4o no se cierra del todo</w:t>
+      </w:r>
+      <w:r>
+        <w:t xml:space="preserve">. C1 (4.08) sigue por debajo de gpt-4o + RAG semántico (4.20 según §10.7.3). Pero la diferencia se reduce de 0.51 puntos (con configuración estándar) a 0.12 puntos (con C1). </w:t>
+      </w:r>
+      <w:r>
+        <w:rPr>
+          <w:b/>
+        </w:rPr>
+        <w:t>Aproximadamente el 76 % del gap se cierra con un único cambio de un parámetro</w:t>
+      </w:r>
+      <w:r>
+        <w:t>, sin tocar el modelo ni el prompt.</w:t>
       </w:r>
     </w:p>
     <w:p>
@@ -13379,12 +13708,12 @@
             <w:vAlign w:val="center"/>
           </w:tcPr>
           <w:p>
-            <w:r/>
-            <w:r>
-              <w:rPr>
-                <w:sz w:val="20"/>
-              </w:rPr>
-              <w:t>**2**</w:t>
+            <w:r>
+              <w:rPr>
+                <w:b/>
+                <w:sz w:val="20"/>
+              </w:rPr>
+              <w:t>2</w:t>
             </w:r>
           </w:p>
         </w:tc>
@@ -14434,12 +14763,12 @@
             <w:vAlign w:val="center"/>
           </w:tcPr>
           <w:p>
-            <w:r/>
-            <w:r>
-              <w:rPr>
-                <w:sz w:val="20"/>
-              </w:rPr>
-              <w:t>**R1 — Estricta (bit-a-bit)**</w:t>
+            <w:r>
+              <w:rPr>
+                <w:b/>
+                <w:sz w:val="20"/>
+              </w:rPr>
+              <w:t>R1 — Estricta (bit-a-bit)</w:t>
             </w:r>
           </w:p>
         </w:tc>
@@ -14482,12 +14811,12 @@
             <w:vAlign w:val="center"/>
           </w:tcPr>
           <w:p>
-            <w:r/>
-            <w:r>
-              <w:rPr>
-                <w:sz w:val="20"/>
-              </w:rPr>
-              <w:t>**R2 — Estadística**</w:t>
+            <w:r>
+              <w:rPr>
+                <w:b/>
+                <w:sz w:val="20"/>
+              </w:rPr>
+              <w:t>R2 — Estadística</w:t>
             </w:r>
           </w:p>
         </w:tc>
@@ -14531,12 +14860,12 @@
             <w:vAlign w:val="center"/>
           </w:tcPr>
           <w:p>
-            <w:r/>
-            <w:r>
-              <w:rPr>
-                <w:sz w:val="20"/>
-              </w:rPr>
-              <w:t>**R3 — Metodológica**</w:t>
+            <w:r>
+              <w:rPr>
+                <w:b/>
+                <w:sz w:val="20"/>
+              </w:rPr>
+              <w:t>R3 — Metodológica</w:t>
             </w:r>
           </w:p>
         </w:tc>
@@ -14585,7 +14914,13 @@
         <w:pStyle w:val="ListBullet"/>
       </w:pPr>
       <w:r>
-        <w:t>**Snapshots de modelo fijos**: gpt-4o se referencia siempre como gpt-4o-2024-05-13 en E4 (la versión que documenta OntoGenix). En los demás experimentos se acepta el alias móvil pero el manifest de reproducibilidad lo registra explícitamente.</w:t>
+        <w:rPr>
+          <w:b/>
+        </w:rPr>
+        <w:t>Snapshots de modelo fijos</w:t>
+      </w:r>
+      <w:r>
+        <w:t>: gpt-4o se referencia siempre como gpt-4o-2024-05-13 en E4 (la versión que documenta OntoGenix). En los demás experimentos se acepta el alias móvil pero el manifest de reproducibilidad lo registra explícitamente.</w:t>
       </w:r>
     </w:p>
     <w:p>
@@ -14593,7 +14928,13 @@
         <w:pStyle w:val="ListBullet"/>
       </w:pPr>
       <w:r>
-        <w:t>**Seeds y temperatura**: temperature=0 (E4) o 0.1 (E1-E3) y seeds incrementales (42, 43, 44) por run. Aunque OpenAI no garantiza determinismo bit-a-bit, esta configuración minimiza la varianza inter-run y permite que tres repeticiones converjan a una media estable.</w:t>
+        <w:rPr>
+          <w:b/>
+        </w:rPr>
+        <w:t>Seeds y temperatura</w:t>
+      </w:r>
+      <w:r>
+        <w:t>: temperature=0 (E4) o 0.1 (E1-E3) y seeds incrementales (42, 43, 44) por run. Aunque OpenAI no garantiza determinismo bit-a-bit, esta configuración minimiza la varianza inter-run y permite que tres repeticiones converjan a una media estable.</w:t>
       </w:r>
     </w:p>
     <w:p>
@@ -14601,7 +14942,13 @@
         <w:pStyle w:val="ListBullet"/>
       </w:pPr>
       <w:r>
-        <w:t>**Versiones pinneadas**: scripts/requirements_e4.txt fija rangos compatibles para los paquetes del pipeline. El repositorio annotationRAG usa un venv aislado para no contaminar el entorno principal del TFM (lección aprendida tras observar incompatibilidades entre numpy 2.x y torch 2.5).</w:t>
+        <w:rPr>
+          <w:b/>
+        </w:rPr>
+        <w:t>Versiones pinneadas</w:t>
+      </w:r>
+      <w:r>
+        <w:t>: scripts/requirements_e4.txt fija rangos compatibles para los paquetes del pipeline. El repositorio annotationRAG usa un venv aislado para no contaminar el entorno principal del TFM (lección aprendida tras observar incompatibilidades entre numpy 2.x y torch 2.5).</w:t>
       </w:r>
     </w:p>
     <w:p>
@@ -14609,7 +14956,13 @@
         <w:pStyle w:val="ListBullet"/>
       </w:pPr>
       <w:r>
-        <w:t>**Hashes SHA-256 de inputs**: el script scripts/check_reproducibility.py genera results/reproducibility_manifest.json con hashes individuales de los 50+ archivos de entrada deterministas (datos brutos, samples, esquemas RAG, scripts). Cualquier modificación accidental se detecta con --diff respecto a un manifest anterior.</w:t>
+        <w:rPr>
+          <w:b/>
+        </w:rPr>
+        <w:t>Hashes SHA-256 de inputs</w:t>
+      </w:r>
+      <w:r>
+        <w:t>: el script scripts/check_reproducibility.py genera results/reproducibility_manifest.json con hashes individuales de los 50+ archivos de entrada deterministas (datos brutos, samples, esquemas RAG, scripts). Cualquier modificación accidental se detecta con --diff respecto a un manifest anterior.</w:t>
       </w:r>
     </w:p>
     <w:p>
@@ -14617,7 +14970,13 @@
         <w:pStyle w:val="ListBullet"/>
       </w:pPr>
       <w:r>
-        <w:t>**Datos congelados**: data/raw/ contiene los TSV originales de FANTOM5 y dbSUPER tal como se descargaron (65 423 y 69 205 filas respectivamente). data/samples/ congela la muestra de 25 filas usada en el experimento principal. data/samples_strategies/ contiene las 4 estrategias del análisis de sensibilidad (§4.3).</w:t>
+        <w:rPr>
+          <w:b/>
+        </w:rPr>
+        <w:t>Datos congelados</w:t>
+      </w:r>
+      <w:r>
+        <w:t>: data/raw/ contiene los TSV originales de FANTOM5 y dbSUPER tal como se descargaron (65 423 y 69 205 filas respectivamente). data/samples/ congela la muestra de 25 filas usada en el experimento principal. data/samples_strategies/ contiene las 4 estrategias del análisis de sensibilidad (§4.3).</w:t>
       </w:r>
     </w:p>
     <w:p>
@@ -14625,7 +14984,13 @@
         <w:pStyle w:val="ListBullet"/>
       </w:pPr>
       <w:r>
-        <w:t>**Prompts versionados en código**: los user prompts de E1-E4 viven como string-constantes en run_gpt_experiments.py (E1-E3) y como ficheros .prompt en OntoGenix/GUI/ (E4). Cualquier cambio queda registrado en el control de versiones del repositorio.</w:t>
+        <w:rPr>
+          <w:b/>
+        </w:rPr>
+        <w:t>Prompts versionados en código</w:t>
+      </w:r>
+      <w:r>
+        <w:t>: los user prompts de E1-E4 viven como string-constantes en run_gpt_experiments.py (E1-E3) y como ficheros .prompt en OntoGenix/GUI/ (E4). Cualquier cambio queda registrado en el control de versiones del repositorio.</w:t>
       </w:r>
     </w:p>
     <w:p>
@@ -14633,7 +14998,13 @@
         <w:pStyle w:val="ListBullet"/>
       </w:pPr>
       <w:r>
-        <w:t>**Manifest de outputs**: cada run produce un metadata_runN.json con timestamp, modelo, seed, número de tokens, finish_reason y validación TTL. Esto permite trazabilidad completa de cada ontología generada.</w:t>
+        <w:rPr>
+          <w:b/>
+        </w:rPr>
+        <w:t>Manifest de outputs</w:t>
+      </w:r>
+      <w:r>
+        <w:t>: cada run produce un metadata_runN.json con timestamp, modelo, seed, número de tokens, finish_reason y validación TTL. Esto permite trazabilidad completa de cada ontología generada.</w:t>
       </w:r>
     </w:p>
     <w:p>
@@ -14733,7 +15104,13 @@
         <w:pStyle w:val="ListBullet"/>
       </w:pPr>
       <w:r>
-        <w:t>**El post-procesado mecánico**. Las primeras corridas E1-E3 con gpt-4o-mini parseaban al 0 % en rdflib y casi tiré la toalla pensando que el modelo era el problema. Bastó con leer los errores: prefijos no declarados, local names con caracteres no escapados, literales tipados con texto. Tres regex después, el 100 % de los TTL recuperables se rescata sin volver a pagar la API. Tengo la sensación de que en mucho del trabajo aplicado de LLM en RDF el problema no es el modelo, sino que nadie ha mirado los errores de cerca.</w:t>
+        <w:rPr>
+          <w:b/>
+        </w:rPr>
+        <w:t>El post-procesado mecánico</w:t>
+      </w:r>
+      <w:r>
+        <w:t>. Las primeras corridas E1-E3 con gpt-4o-mini parseaban al 0 % en rdflib y casi tiré la toalla pensando que el modelo era el problema. Bastó con leer los errores: prefijos no declarados, local names con caracteres no escapados, literales tipados con texto. Tres regex después, el 100 % de los TTL recuperables se rescata sin volver a pagar la API. Tengo la sensación de que en mucho del trabajo aplicado de LLM en RDF el problema no es el modelo, sino que nadie ha mirado los errores de cerca.</w:t>
       </w:r>
     </w:p>
     <w:p>
@@ -14741,7 +15118,13 @@
         <w:pStyle w:val="ListBullet"/>
       </w:pPr>
       <w:r>
-        <w:t>**El RAG semántico real**. Esperaba una mejora marginal sobre el keyword-match. Lo que vi fue +1.29 puntos OQuaRE, +44 % relativo, con Operability subiendo ×6.6. La diferencia no es que el embedding encuentre ontologías «mejores»: es que devuelve metadata estructurada (clases, propiedades, scores) que el modelo puede materializar, en lugar de bloques de Turtle sin contexto.</w:t>
+        <w:rPr>
+          <w:b/>
+        </w:rPr>
+        <w:t>El RAG semántico real</w:t>
+      </w:r>
+      <w:r>
+        <w:t>. Esperaba una mejora marginal sobre el keyword-match. Lo que vi fue +1.29 puntos OQuaRE, +44 % relativo, con Operability subiendo ×6.6. La diferencia no es que el embedding encuentre ontologías «mejores»: es que devuelve metadata estructurada (clases, propiedades, scores) que el modelo puede materializar, en lugar de bloques de Turtle sin contexto.</w:t>
       </w:r>
     </w:p>
     <w:p>
@@ -14749,7 +15132,13 @@
         <w:pStyle w:val="ListBullet"/>
       </w:pPr>
       <w:r>
-        <w:t>**La calibración del RAG para Llama**. Al ver que el RAG real ayudaba poco a Llama (+0.24 vs +1.29 de gpt-4o), supuse que era un problema de capacidad del modelo. La calibración demostró lo contrario: bajar top_k de 5 a 2 cierra el 76 % del gap. El modelo pequeño no era el cuello de botella; lo era la saturación de su ventana con contexto no relevante. Cambiar un número en una llamada HTTP movió la aguja más que cambiar de modelo.</w:t>
+        <w:rPr>
+          <w:b/>
+        </w:rPr>
+        <w:t>La calibración del RAG para Llama</w:t>
+      </w:r>
+      <w:r>
+        <w:t>. Al ver que el RAG real ayudaba poco a Llama (+0.24 vs +1.29 de gpt-4o), supuse que era un problema de capacidad del modelo. La calibración demostró lo contrario: bajar top_k de 5 a 2 cierra el 76 % del gap. El modelo pequeño no era el cuello de botella; lo era la saturación de su ventana con contexto no relevante. Cambiar un número en una llamada HTTP movió la aguja más que cambiar de modelo.</w:t>
       </w:r>
     </w:p>
     <w:p>
@@ -14765,7 +15154,13 @@
         <w:pStyle w:val="ListBullet"/>
       </w:pPr>
       <w:r>
-        <w:t>**Falló como esperaba**: Llama 3.1 8B en E1 (zero-shot). El modelo pequeño no genera Turtle válido sin guía. El patrón «crm a owl:Class» (omisión del «:» del prefijo) aparece en 4 de 11 corridas E1 y en 5 de 12 corridas E2 (9 fallos irrecuperables sobre 23 corridas), y no es recuperable mecánicamente. Esto es previsible y no me sorprendió.</w:t>
+        <w:rPr>
+          <w:b/>
+        </w:rPr>
+        <w:t>Falló como esperaba</w:t>
+      </w:r>
+      <w:r>
+        <w:t>: Llama 3.1 8B en E1 (zero-shot). El modelo pequeño no genera Turtle válido sin guía. El patrón «crm a owl:Class» (omisión del «:» del prefijo) aparece en 4 de 11 corridas E1 y en 5 de 12 corridas E2 (9 fallos irrecuperables sobre 23 corridas), y no es recuperable mecánicamente. Esto es previsible y no me sorprendió.</w:t>
       </w:r>
     </w:p>
     <w:p>
@@ -14773,7 +15168,13 @@
         <w:pStyle w:val="ListBullet"/>
       </w:pPr>
       <w:r>
-        <w:t>**No falló como esperaba**: Qwen 2.5 Coder 7B. Asumía que un modelo entrenado específicamente en código generaría Turtle más limpio que un generalista del mismo tamaño. Y sí lo hace, pero solo en algunos contextos. En zero-shot (E1) cero corridas válidas; en E3 con RAG, doce. La especialización no es lineal: Qwen mezcla sintaxis Turtle con RDF/XML («owl:Ontology rdf:about») porque el corpus de entrenamiento incluye múltiples serializaciones RDF y el modelo no aprende a distinguirlas en zero-shot.</w:t>
+        <w:rPr>
+          <w:b/>
+        </w:rPr>
+        <w:t>No falló como esperaba</w:t>
+      </w:r>
+      <w:r>
+        <w:t>: Qwen 2.5 Coder 7B. Asumía que un modelo entrenado específicamente en código generaría Turtle más limpio que un generalista del mismo tamaño. Y sí lo hace, pero solo en algunos contextos. En zero-shot (E1) cero corridas válidas; en E3 con RAG, doce. La especialización no es lineal: Qwen mezcla sintaxis Turtle con RDF/XML («owl:Ontology rdf:about») porque el corpus de entrenamiento incluye múltiples serializaciones RDF y el modelo no aprende a distinguirlas en zero-shot.</w:t>
       </w:r>
     </w:p>
     <w:p>
@@ -14781,7 +15182,13 @@
         <w:pStyle w:val="ListBullet"/>
       </w:pPr>
       <w:r>
-        <w:t>**Falló de forma inesperada**: el determinismo. Asumía que con temperature=0 y seed fija, gpt-4o produciría outputs idénticos. No los produce. Las diferencias son pequeñas (±5 % en n_triples) pero las hay, y son detectables comparando manifests entre corridas. Si esto le importa a alguien que esté evaluando para producción, hay que reportar varianza, no medias puntuales.</w:t>
+        <w:rPr>
+          <w:b/>
+        </w:rPr>
+        <w:t>Falló de forma inesperada</w:t>
+      </w:r>
+      <w:r>
+        <w:t>: el determinismo. Asumía que con temperature=0 y seed fija, gpt-4o produciría outputs idénticos. No los produce. Las diferencias son pequeñas (±5 % en n_triples) pero las hay, y son detectables comparando manifests entre corridas. Si esto le importa a alguien que esté evaluando para producción, hay que reportar varianza, no medias puntuales.</w:t>
       </w:r>
     </w:p>
     <w:p>
@@ -14797,7 +15204,13 @@
         <w:pStyle w:val="ListBullet"/>
       </w:pPr>
       <w:r>
-        <w:t>**OQuaRE penaliza la complejidad estructural**. El cuadro 4×3 de §10.4 muestra una inversión inesperada: en E2 con vocabulario controlado, Llama 3.1 8B (4.40) supera a gpt-4o (3.98). No porque sus ontologías sean «mejores» en sentido absoluto: son más simples y por tanto caen en el óptimo de las rúbricas. OQuaRE está calibrado para ontologías de tamaño medio. Las ricas saturan WMCOnto y NOMOnto; las pobres se quedan cortas en ANOnto. Reportar solo OQuaRE Global puede ocultar lo que realmente pasa. Importante: este sesgo de la rúbrica afecta a TODAS las comparaciones del trabajo, no solo cuando contradice la narrativa. Cuando reporto que «E4 OntoGenix gana en riqueza absoluta pero pierde en OQuaRE» (§8 vs §10) o que «el RAG real cierra el 76 % del gap» (§10.7.7), ambas afirmaciones operan bajo la misma limitación: OQuaRE mide forma estructural, no fidelidad de dominio. La conclusión global del TFM —que el binomio modelo+método importa— no descansa solo en el ranking OQuaRE; se apoya también en métricas absolutas (n_triples, n_labels) y en patrones de error cualitativos (§10.2). Idealmente, el siguiente paso es validación experta sobre un subset (§13.6).</w:t>
+        <w:rPr>
+          <w:b/>
+        </w:rPr>
+        <w:t>OQuaRE penaliza la complejidad estructural</w:t>
+      </w:r>
+      <w:r>
+        <w:t>. El cuadro 4×3 de §10.4 muestra una inversión inesperada: en E2 con vocabulario controlado, Llama 3.1 8B (4.40) supera a gpt-4o (3.98). No porque sus ontologías sean «mejores» en sentido absoluto: son más simples y por tanto caen en el óptimo de las rúbricas. OQuaRE está calibrado para ontologías de tamaño medio. Las ricas saturan WMCOnto y NOMOnto; las pobres se quedan cortas en ANOnto. Reportar solo OQuaRE Global puede ocultar lo que realmente pasa. Importante: este sesgo de la rúbrica afecta a TODAS las comparaciones del trabajo, no solo cuando contradice la narrativa. Cuando reporto que «E4 OntoGenix gana en riqueza absoluta pero pierde en OQuaRE» (§8 vs §10) o que «el RAG real cierra el 76 % del gap» (§10.7.7), ambas afirmaciones operan bajo la misma limitación: OQuaRE mide forma estructural, no fidelidad de dominio. La conclusión global del TFM —que el binomio modelo+método importa— no descansa solo en el ranking OQuaRE; se apoya también en métricas absolutas (n_triples, n_labels) y en patrones de error cualitativos (§10.2). Idealmente, el siguiente paso es validación experta sobre un subset (§13.6).</w:t>
       </w:r>
     </w:p>
     <w:p>
@@ -14805,7 +15218,13 @@
         <w:pStyle w:val="ListBullet"/>
       </w:pPr>
       <w:r>
-        <w:t>**El RAG induce errores nuevos en modelos pequeños**. La fig08 lo muestra de forma rotunda: 24 alucinaciones tipadas en E3 con Llama, 24 con Qwen, exactamente las mismas, y cero en gpt-4o o en cualquier otro experimento. El contexto recuperado contiene patrones tipo «start_position»^^xsd:integer que el modelo pequeño copia literalmente sin entender que «start_position» es un placeholder. Esto no es un error del modelo. Es un error de la interacción RAG × modelo.</w:t>
+        <w:rPr>
+          <w:b/>
+        </w:rPr>
+        <w:t>El RAG induce errores nuevos en modelos pequeños</w:t>
+      </w:r>
+      <w:r>
+        <w:t>. La fig08 lo muestra de forma rotunda: 24 alucinaciones tipadas en E3 con Llama, 24 con Qwen, exactamente las mismas, y cero en gpt-4o o en cualquier otro experimento. El contexto recuperado contiene patrones tipo «start_position»^^xsd:integer que el modelo pequeño copia literalmente sin entender que «start_position» es un placeholder. Esto no es un error del modelo. Es un error de la interacción RAG × modelo.</w:t>
       </w:r>
     </w:p>
     <w:p>
@@ -14813,7 +15232,31 @@
         <w:pStyle w:val="ListBullet"/>
       </w:pPr>
       <w:r>
-        <w:t>**Las plantillas cisreg de referencia tienen erratas**. Tres ocurrencias de «&gt;» espurios en `crm2tfac.ttl` y `crm2tfac_example.ttl` impedían que rdflib parseara los esquemas. Estaban ahí desde la publicación original. Encontrarlas requirió pasar el contenido por un parser estricto. Es probable que otros usuarios de las plantillas hayan asumido que «no funcionan» y las hayan abandonado.</w:t>
+        <w:rPr>
+          <w:b/>
+        </w:rPr>
+        <w:t>Las plantillas cisreg de referencia tienen erratas</w:t>
+      </w:r>
+      <w:r>
+        <w:t xml:space="preserve">. Tres ocurrencias de «&gt;» espurios en </w:t>
+      </w:r>
+      <w:r>
+        <w:rPr>
+          <w:rFonts w:ascii="Consolas" w:hAnsi="Consolas"/>
+        </w:rPr>
+        <w:t>crm2tfac.ttl</w:t>
+      </w:r>
+      <w:r>
+        <w:t xml:space="preserve"> y </w:t>
+      </w:r>
+      <w:r>
+        <w:rPr>
+          <w:rFonts w:ascii="Consolas" w:hAnsi="Consolas"/>
+        </w:rPr>
+        <w:t>crm2tfac_example.ttl</w:t>
+      </w:r>
+      <w:r>
+        <w:t xml:space="preserve"> impedían que rdflib parseara los esquemas. Estaban ahí desde la publicación original. Encontrarlas requirió pasar el contenido por un parser estricto. Es probable que otros usuarios de las plantillas hayan asumido que «no funcionan» y las hayan abandonado.</w:t>
       </w:r>
     </w:p>
     <w:p>
@@ -14834,7 +15277,22 @@
         <w:pStyle w:val="ListBullet"/>
       </w:pPr>
       <w:r>
-        <w:t>**Reportar n_runs y media simultáneamente**. Una OQuaRE Global de 4.20 con 11 corridas válidas no es comparable con 4.20 sobre 12. La media oculta la fragilidad. Toda tabla del TFM lleva la columna `n_runs OK / n_total` precisamente por esto.</w:t>
+        <w:rPr>
+          <w:b/>
+        </w:rPr>
+        <w:t>Reportar n_runs y media simultáneamente</w:t>
+      </w:r>
+      <w:r>
+        <w:t xml:space="preserve">. Una OQuaRE Global de 4.20 con 11 corridas válidas no es comparable con 4.20 sobre 12. La media oculta la fragilidad. Toda tabla del TFM lleva la columna </w:t>
+      </w:r>
+      <w:r>
+        <w:rPr>
+          <w:rFonts w:ascii="Consolas" w:hAnsi="Consolas"/>
+        </w:rPr>
+        <w:t>n_runs OK / n_total</w:t>
+      </w:r>
+      <w:r>
+        <w:t xml:space="preserve"> precisamente por esto.</w:t>
       </w:r>
     </w:p>
     <w:p>
@@ -14842,7 +15300,13 @@
         <w:pStyle w:val="ListBullet"/>
       </w:pPr>
       <w:r>
-        <w:t>**Diseñar el post-procesado antes que el experimento**. El 50 % de mis primeras corridas se descartaba por errores recuperables. Si hubiera implementado el post-procesado al principio, me habría ahorrado dos rondas de re-ejecución y unos 10 dólares en API. Lección: una pipeline experimental con LLMs necesita una capa de saneo automatizada como ciudadano de primera, no como apaño tardío.</w:t>
+        <w:rPr>
+          <w:b/>
+        </w:rPr>
+        <w:t>Diseñar el post-procesado antes que el experimento</w:t>
+      </w:r>
+      <w:r>
+        <w:t>. El 50 % de mis primeras corridas se descartaba por errores recuperables. Si hubiera implementado el post-procesado al principio, me habría ahorrado dos rondas de re-ejecución y unos 10 dólares en API. Lección: una pipeline experimental con LLMs necesita una capa de saneo automatizada como ciudadano de primera, no como apaño tardío.</w:t>
       </w:r>
     </w:p>
     <w:p>
@@ -14850,7 +15314,13 @@
         <w:pStyle w:val="ListBullet"/>
       </w:pPr>
       <w:r>
-        <w:t>**Aislar entornos de servicios externos**. Mezclar las dependencias de annotationRAG con las del TFM rompió numpy, torch, openai y media docena más. El venv aislado fue la única solución. Cualquier microservicio LLM con dependencias modernas tiene que correr aislado, sin excepción.</w:t>
+        <w:rPr>
+          <w:b/>
+        </w:rPr>
+        <w:t>Aislar entornos de servicios externos</w:t>
+      </w:r>
+      <w:r>
+        <w:t>. Mezclar las dependencias de annotationRAG con las del TFM rompió numpy, torch, openai y media docena más. El venv aislado fue la única solución. Cualquier microservicio LLM con dependencias modernas tiene que correr aislado, sin excepción.</w:t>
       </w:r>
     </w:p>
     <w:p>
@@ -14858,7 +15328,13 @@
         <w:pStyle w:val="ListBullet"/>
       </w:pPr>
       <w:r>
-        <w:t>**Cuestionar las rúbricas, no solo los resultados**. La inversión OQuaRE de §10.5 entre modelos abiertos y cerrados es real, pero la lectura literal sería que Llama supera a gpt-4o. Eso es un artefacto de la métrica, no una verdad sobre los modelos. Los benchmarks normativos son útiles cuando uno entiende qué optimizan; peligrosos cuando se reportan como verdad absoluta.</w:t>
+        <w:rPr>
+          <w:b/>
+        </w:rPr>
+        <w:t>Cuestionar las rúbricas, no solo los resultados</w:t>
+      </w:r>
+      <w:r>
+        <w:t>. La inversión OQuaRE de §10.5 entre modelos abiertos y cerrados es real, pero la lectura literal sería que Llama supera a gpt-4o. Eso es un artefacto de la métrica, no una verdad sobre los modelos. Los benchmarks normativos son útiles cuando uno entiende qué optimizan; peligrosos cuando se reportan como verdad absoluta.</w:t>
       </w:r>
     </w:p>
     <w:p>
@@ -14866,7 +15342,13 @@
         <w:pStyle w:val="ListBullet"/>
       </w:pPr>
       <w:r>
-        <w:t>**Documentar lo que falla, no solo lo que funciona**. La sección de fallos irrecuperables de Llama (§10.2) y el reporte explícito de las 9 corridas que el post-procesado no recupera son tan importantes como las tablas de éxito. Ocultarlos sería más fácil; mostrarlos hace al trabajo defendible.</w:t>
+        <w:rPr>
+          <w:b/>
+        </w:rPr>
+        <w:t>Documentar lo que falla, no solo lo que funciona</w:t>
+      </w:r>
+      <w:r>
+        <w:t>. La sección de fallos irrecuperables de Llama (§10.2) y el reporte explícito de las 9 corridas que el post-procesado no recupera son tan importantes como las tablas de éxito. Ocultarlos sería más fácil; mostrarlos hace al trabajo defendible.</w:t>
       </w:r>
     </w:p>
     <w:p>
@@ -14887,7 +15369,13 @@
         <w:pStyle w:val="ListBullet"/>
       </w:pPr>
       <w:r>
-        <w:t>**Tamaño del corpus de evaluación**. 4 BBDD × 3 runs × 4 experimentos × 3 modelos da una n teórica de 144 ontologías. Tras descartar fallos no recuperables y experimentos incompletos (E4 con open-source, calibración E3 con Llama), la n efectiva del análisis principal queda en torno a 96. Es suficiente para tendencias robustas; insuficiente para tests estadísticos formales por celda.</w:t>
+        <w:rPr>
+          <w:b/>
+        </w:rPr>
+        <w:t>Tamaño del corpus de evaluación</w:t>
+      </w:r>
+      <w:r>
+        <w:t>. 4 BBDD × 3 runs × 4 experimentos × 3 modelos da una n teórica de 144 ontologías. Tras descartar fallos no recuperables y experimentos incompletos (E4 con open-source, calibración E3 con Llama), la n efectiva del análisis principal queda en torno a 96. Es suficiente para tendencias robustas; insuficiente para tests estadísticos formales por celda.</w:t>
       </w:r>
     </w:p>
     <w:p>
@@ -14895,7 +15383,13 @@
         <w:pStyle w:val="ListBullet"/>
       </w:pPr>
       <w:r>
-        <w:t>**Falta de ground truth**. Comparé las ontologías generadas entre sí con OQuaRE, pero no contra una ontología «correcta» del dominio. Sin un experto humano evaluando una muestra (~20 ontologías), no puedo decir si las que OQuaRE puntúa alto son biomédicamente correctas o simplemente bien estructuradas. La validación experta queda como trabajo futuro inmediato.</w:t>
+        <w:rPr>
+          <w:b/>
+        </w:rPr>
+        <w:t>Falta de ground truth</w:t>
+      </w:r>
+      <w:r>
+        <w:t>. Comparé las ontologías generadas entre sí con OQuaRE, pero no contra una ontología «correcta» del dominio. Sin un experto humano evaluando una muestra (~20 ontologías), no puedo decir si las que OQuaRE puntúa alto son biomédicamente correctas o simplemente bien estructuradas. La validación experta queda como trabajo futuro inmediato.</w:t>
       </w:r>
     </w:p>
     <w:p>
@@ -14903,7 +15397,13 @@
         <w:pStyle w:val="ListBullet"/>
       </w:pPr>
       <w:r>
-        <w:t>**Sesgo de modelo cerrado**. La pipeline E4 (OntoGenix) está diseñada para gpt-4o y no la repliqué con éxito en open-source. Por tanto, parte de la conclusión sobre «el método compensa al modelo» (§10.6) descansa sobre 12 corridas con un único binomio. Replicar E4 con Llama 3.1 70B (no 8B) sería el siguiente paso lógico.</w:t>
+        <w:rPr>
+          <w:b/>
+        </w:rPr>
+        <w:t>Sesgo de modelo cerrado</w:t>
+      </w:r>
+      <w:r>
+        <w:t>. La pipeline E4 (OntoGenix) está diseñada para gpt-4o y no la repliqué con éxito en open-source. Por tanto, parte de la conclusión sobre «el método compensa al modelo» (§10.6) descansa sobre 12 corridas con un único binomio. Replicar E4 con Llama 3.1 70B (no 8B) sería el siguiente paso lógico.</w:t>
       </w:r>
     </w:p>
     <w:p>
@@ -14911,7 +15411,22 @@
         <w:pStyle w:val="ListBullet"/>
       </w:pPr>
       <w:r>
-        <w:t>**Drift de dependencias durante el TFM**. La integración de annotationRAG durante el desarrollo coincidió con un cambio de versión de numpy y torch que rompió varias librerías instaladas en el entorno principal. El experimento se completó, pero la documentación del estado de dependencias en cada ejecución (vía `check_reproducibility.py`) es retrospectiva, no longitudinal.</w:t>
+        <w:rPr>
+          <w:b/>
+        </w:rPr>
+        <w:t>Drift de dependencias durante el TFM</w:t>
+      </w:r>
+      <w:r>
+        <w:t xml:space="preserve">. La integración de annotationRAG durante el desarrollo coincidió con un cambio de versión de numpy y torch que rompió varias librerías instaladas en el entorno principal. El experimento se completó, pero la documentación del estado de dependencias en cada ejecución (vía </w:t>
+      </w:r>
+      <w:r>
+        <w:rPr>
+          <w:rFonts w:ascii="Consolas" w:hAnsi="Consolas"/>
+        </w:rPr>
+        <w:t>check_reproducibility.py</w:t>
+      </w:r>
+      <w:r>
+        <w:t>) es retrospectiva, no longitudinal.</w:t>
       </w:r>
     </w:p>
     <w:p>
@@ -14927,7 +15442,13 @@
         <w:pStyle w:val="ListBullet"/>
       </w:pPr>
       <w:r>
-        <w:t>**Validación experta sobre subset**. Tomar 20 ontologías estratificadas (5 por experimento) y pedir a un ontólogo biomédico que las evalúe contra criterios establecidos (BioPortal Quality Profile, NCBO Recommender). Comparar el ranking experto con el ranking OQuaRE. Si correlacionan, OQuaRE es operativo en el dominio; si no, hay que construir métrica específica.</w:t>
+        <w:rPr>
+          <w:b/>
+        </w:rPr>
+        <w:t>Validación experta sobre subset</w:t>
+      </w:r>
+      <w:r>
+        <w:t>. Tomar 20 ontologías estratificadas (5 por experimento) y pedir a un ontólogo biomédico que las evalúe contra criterios establecidos (BioPortal Quality Profile, NCBO Recommender). Comparar el ranking experto con el ranking OQuaRE. Si correlacionan, OQuaRE es operativo en el dominio; si no, hay que construir métrica específica.</w:t>
       </w:r>
     </w:p>
     <w:p>
@@ -14935,7 +15456,13 @@
         <w:pStyle w:val="ListBullet"/>
       </w:pPr>
       <w:r>
-        <w:t>**Replicar E4 con Llama 3.1 70B**. La pipeline OntoGenix con un modelo open-source de tamaño comparable a gpt-4o permitiría aislar definitivamente el efecto «método» del efecto «modelo». Requiere una máquina con 64 GB+ de RAM o servicio remoto tipo Together o Groq.</w:t>
+        <w:rPr>
+          <w:b/>
+        </w:rPr>
+        <w:t>Replicar E4 con Llama 3.1 70B</w:t>
+      </w:r>
+      <w:r>
+        <w:t>. La pipeline OntoGenix con un modelo open-source de tamaño comparable a gpt-4o permitiría aislar definitivamente el efecto «método» del efecto «modelo». Requiere una máquina con 64 GB+ de RAM o servicio remoto tipo Together o Groq.</w:t>
       </w:r>
     </w:p>
     <w:p>
@@ -14943,7 +15470,13 @@
         <w:pStyle w:val="ListBullet"/>
       </w:pPr>
       <w:r>
-        <w:t>**Generalizar fuera del dominio cisreg**. El experimento más valioso para el campo sería repetir todo el banco con una fuente de datos no biomédica (clinical trials, drug-target, wine-vineyards) para ver si los hallazgos cualitativos se mantienen. Si el RAG semántico también añade +1 punto OQuaRE en esos dominios, la guía operativa de §10.7.7 se convierte en una recomendación general; si no, queda específica del dominio.</w:t>
+        <w:rPr>
+          <w:b/>
+        </w:rPr>
+        <w:t>Generalizar fuera del dominio cisreg</w:t>
+      </w:r>
+      <w:r>
+        <w:t>. El experimento más valioso para el campo sería repetir todo el banco con una fuente de datos no biomédica (clinical trials, drug-target, wine-vineyards) para ver si los hallazgos cualitativos se mantienen. Si el RAG semántico también añade +1 punto OQuaRE en esos dominios, la guía operativa de §10.7.7 se convierte en una recomendación general; si no, queda específica del dominio.</w:t>
       </w:r>
     </w:p>
     <w:p>
@@ -15342,6 +15875,12 @@
       </w:r>
     </w:p>
     <w:sectPr>
+      <w:headerReference w:type="default" r:id="rId21"/>
+      <w:footerReference w:type="default" r:id="rId22"/>
+      <w:headerReference w:type="first" r:id="rId23"/>
+      <w:footerReference w:type="first" r:id="rId24"/>
+      <w:headerReference w:type="even" r:id="rId25"/>
+      <w:footerReference w:type="even" r:id="rId26"/>
       <w:pgSz w:w="12240" w:h="15840"/>
       <w:pgMar w:top="1417" w:right="1701" w:bottom="1417" w:left="1701" w:header="720" w:footer="720" w:gutter="0"/>
       <w:cols w:space="720"/>
@@ -15349,6 +15888,66 @@
     </w:sectPr>
   </w:body>
 </w:document>
+</file>
+
+<file path=word/footer1.xml><?xml version="1.0" encoding="utf-8"?>
+<w:ftr xmlns:m="http://schemas.openxmlformats.org/officeDocument/2006/math" xmlns:mc="http://schemas.openxmlformats.org/markup-compatibility/2006" xmlns:mo="http://schemas.microsoft.com/office/mac/office/2008/main" xmlns:mv="urn:schemas-microsoft-com:mac:vml" xmlns:o="urn:schemas-microsoft-com:office:office" xmlns:r="http://schemas.openxmlformats.org/officeDocument/2006/relationships" xmlns:v="urn:schemas-microsoft-com:vml" xmlns:w10="urn:schemas-microsoft-com:office:word" xmlns:w14="http://schemas.microsoft.com/office/word/2010/wordml" xmlns:w="http://schemas.openxmlformats.org/wordprocessingml/2006/main" xmlns:wne="http://schemas.microsoft.com/office/word/2006/wordml" xmlns:wp14="http://schemas.microsoft.com/office/word/2010/wordprocessingDrawing" xmlns:wp="http://schemas.openxmlformats.org/drawingml/2006/wordprocessingDrawing" xmlns:wpc="http://schemas.microsoft.com/office/word/2010/wordprocessingCanvas" xmlns:wpg="http://schemas.microsoft.com/office/word/2010/wordprocessingGroup" xmlns:wpi="http://schemas.microsoft.com/office/word/2010/wordprocessingInk" xmlns:wps="http://schemas.microsoft.com/office/word/2010/wordprocessingShape" mc:Ignorable="w14 wp14">
+  <w:p>
+    <w:pPr>
+      <w:pStyle w:val="Footer"/>
+    </w:pPr>
+  </w:p>
+</w:ftr>
+</file>
+
+<file path=word/footer2.xml><?xml version="1.0" encoding="utf-8"?>
+<w:ftr xmlns:m="http://schemas.openxmlformats.org/officeDocument/2006/math" xmlns:mc="http://schemas.openxmlformats.org/markup-compatibility/2006" xmlns:mo="http://schemas.microsoft.com/office/mac/office/2008/main" xmlns:mv="urn:schemas-microsoft-com:mac:vml" xmlns:o="urn:schemas-microsoft-com:office:office" xmlns:r="http://schemas.openxmlformats.org/officeDocument/2006/relationships" xmlns:v="urn:schemas-microsoft-com:vml" xmlns:w10="urn:schemas-microsoft-com:office:word" xmlns:w14="http://schemas.microsoft.com/office/word/2010/wordml" xmlns:w="http://schemas.openxmlformats.org/wordprocessingml/2006/main" xmlns:wne="http://schemas.microsoft.com/office/word/2006/wordml" xmlns:wp14="http://schemas.microsoft.com/office/word/2010/wordprocessingDrawing" xmlns:wp="http://schemas.openxmlformats.org/drawingml/2006/wordprocessingDrawing" xmlns:wpc="http://schemas.microsoft.com/office/word/2010/wordprocessingCanvas" xmlns:wpg="http://schemas.microsoft.com/office/word/2010/wordprocessingGroup" xmlns:wpi="http://schemas.microsoft.com/office/word/2010/wordprocessingInk" xmlns:wps="http://schemas.microsoft.com/office/word/2010/wordprocessingShape" mc:Ignorable="w14 wp14">
+  <w:p>
+    <w:pPr>
+      <w:pStyle w:val="Footer"/>
+    </w:pPr>
+  </w:p>
+</w:ftr>
+</file>
+
+<file path=word/footer3.xml><?xml version="1.0" encoding="utf-8"?>
+<w:ftr xmlns:m="http://schemas.openxmlformats.org/officeDocument/2006/math" xmlns:mc="http://schemas.openxmlformats.org/markup-compatibility/2006" xmlns:mo="http://schemas.microsoft.com/office/mac/office/2008/main" xmlns:mv="urn:schemas-microsoft-com:mac:vml" xmlns:o="urn:schemas-microsoft-com:office:office" xmlns:r="http://schemas.openxmlformats.org/officeDocument/2006/relationships" xmlns:v="urn:schemas-microsoft-com:vml" xmlns:w10="urn:schemas-microsoft-com:office:word" xmlns:w14="http://schemas.microsoft.com/office/word/2010/wordml" xmlns:w="http://schemas.openxmlformats.org/wordprocessingml/2006/main" xmlns:wne="http://schemas.microsoft.com/office/word/2006/wordml" xmlns:wp14="http://schemas.microsoft.com/office/word/2010/wordprocessingDrawing" xmlns:wp="http://schemas.openxmlformats.org/drawingml/2006/wordprocessingDrawing" xmlns:wpc="http://schemas.microsoft.com/office/word/2010/wordprocessingCanvas" xmlns:wpg="http://schemas.microsoft.com/office/word/2010/wordprocessingGroup" xmlns:wpi="http://schemas.microsoft.com/office/word/2010/wordprocessingInk" xmlns:wps="http://schemas.microsoft.com/office/word/2010/wordprocessingShape" mc:Ignorable="w14 wp14">
+  <w:p>
+    <w:pPr>
+      <w:pStyle w:val="Footer"/>
+    </w:pPr>
+  </w:p>
+</w:ftr>
+</file>
+
+<file path=word/header1.xml><?xml version="1.0" encoding="utf-8"?>
+<w:hdr xmlns:m="http://schemas.openxmlformats.org/officeDocument/2006/math" xmlns:mc="http://schemas.openxmlformats.org/markup-compatibility/2006" xmlns:mo="http://schemas.microsoft.com/office/mac/office/2008/main" xmlns:mv="urn:schemas-microsoft-com:mac:vml" xmlns:o="urn:schemas-microsoft-com:office:office" xmlns:r="http://schemas.openxmlformats.org/officeDocument/2006/relationships" xmlns:v="urn:schemas-microsoft-com:vml" xmlns:w10="urn:schemas-microsoft-com:office:word" xmlns:w14="http://schemas.microsoft.com/office/word/2010/wordml" xmlns:w="http://schemas.openxmlformats.org/wordprocessingml/2006/main" xmlns:wne="http://schemas.microsoft.com/office/word/2006/wordml" xmlns:wp14="http://schemas.microsoft.com/office/word/2010/wordprocessingDrawing" xmlns:wp="http://schemas.openxmlformats.org/drawingml/2006/wordprocessingDrawing" xmlns:wpc="http://schemas.microsoft.com/office/word/2010/wordprocessingCanvas" xmlns:wpg="http://schemas.microsoft.com/office/word/2010/wordprocessingGroup" xmlns:wpi="http://schemas.microsoft.com/office/word/2010/wordprocessingInk" xmlns:wps="http://schemas.microsoft.com/office/word/2010/wordprocessingShape" mc:Ignorable="w14 wp14">
+  <w:p>
+    <w:pPr>
+      <w:pStyle w:val="Header"/>
+    </w:pPr>
+  </w:p>
+</w:hdr>
+</file>
+
+<file path=word/header2.xml><?xml version="1.0" encoding="utf-8"?>
+<w:hdr xmlns:m="http://schemas.openxmlformats.org/officeDocument/2006/math" xmlns:mc="http://schemas.openxmlformats.org/markup-compatibility/2006" xmlns:mo="http://schemas.microsoft.com/office/mac/office/2008/main" xmlns:mv="urn:schemas-microsoft-com:mac:vml" xmlns:o="urn:schemas-microsoft-com:office:office" xmlns:r="http://schemas.openxmlformats.org/officeDocument/2006/relationships" xmlns:v="urn:schemas-microsoft-com:vml" xmlns:w10="urn:schemas-microsoft-com:office:word" xmlns:w14="http://schemas.microsoft.com/office/word/2010/wordml" xmlns:w="http://schemas.openxmlformats.org/wordprocessingml/2006/main" xmlns:wne="http://schemas.microsoft.com/office/word/2006/wordml" xmlns:wp14="http://schemas.microsoft.com/office/word/2010/wordprocessingDrawing" xmlns:wp="http://schemas.openxmlformats.org/drawingml/2006/wordprocessingDrawing" xmlns:wpc="http://schemas.microsoft.com/office/word/2010/wordprocessingCanvas" xmlns:wpg="http://schemas.microsoft.com/office/word/2010/wordprocessingGroup" xmlns:wpi="http://schemas.microsoft.com/office/word/2010/wordprocessingInk" xmlns:wps="http://schemas.microsoft.com/office/word/2010/wordprocessingShape" mc:Ignorable="w14 wp14">
+  <w:p>
+    <w:pPr>
+      <w:pStyle w:val="Header"/>
+    </w:pPr>
+  </w:p>
+</w:hdr>
+</file>
+
+<file path=word/header3.xml><?xml version="1.0" encoding="utf-8"?>
+<w:hdr xmlns:m="http://schemas.openxmlformats.org/officeDocument/2006/math" xmlns:mc="http://schemas.openxmlformats.org/markup-compatibility/2006" xmlns:mo="http://schemas.microsoft.com/office/mac/office/2008/main" xmlns:mv="urn:schemas-microsoft-com:mac:vml" xmlns:o="urn:schemas-microsoft-com:office:office" xmlns:r="http://schemas.openxmlformats.org/officeDocument/2006/relationships" xmlns:v="urn:schemas-microsoft-com:vml" xmlns:w10="urn:schemas-microsoft-com:office:word" xmlns:w14="http://schemas.microsoft.com/office/word/2010/wordml" xmlns:w="http://schemas.openxmlformats.org/wordprocessingml/2006/main" xmlns:wne="http://schemas.microsoft.com/office/word/2006/wordml" xmlns:wp14="http://schemas.microsoft.com/office/word/2010/wordprocessingDrawing" xmlns:wp="http://schemas.openxmlformats.org/drawingml/2006/wordprocessingDrawing" xmlns:wpc="http://schemas.microsoft.com/office/word/2010/wordprocessingCanvas" xmlns:wpg="http://schemas.microsoft.com/office/word/2010/wordprocessingGroup" xmlns:wpi="http://schemas.microsoft.com/office/word/2010/wordprocessingInk" xmlns:wps="http://schemas.microsoft.com/office/word/2010/wordprocessingShape" mc:Ignorable="w14 wp14">
+  <w:p>
+    <w:pPr>
+      <w:pStyle w:val="Header"/>
+    </w:pPr>
+  </w:p>
+</w:hdr>
 </file>
 
 <file path=word/numbering.xml><?xml version="1.0" encoding="utf-8"?>

</xml_diff>